<commit_message>
Aws lambda, S3 trigger using glue inhand practice completed
</commit_message>
<xml_diff>
--- a/New folder/Lambda-WithS3Trigger- Doc 2.docx
+++ b/New folder/Lambda-WithS3Trigger- Doc 2.docx
@@ -100,19 +100,8 @@
           <w:color w:val="16191F"/>
           <w:highlight w:val="white"/>
         </w:rPr>
-        <w:t xml:space="preserve">Add </w:t>
+        <w:t>Add Lambda_adminRole</w:t>
       </w:r>
-      <w:proofErr w:type="spellStart"/>
-      <w:r>
-        <w:rPr>
-          <w:rFonts w:ascii="Roboto" w:eastAsia="Roboto" w:hAnsi="Roboto" w:cs="Roboto"/>
-          <w:b/>
-          <w:color w:val="16191F"/>
-          <w:highlight w:val="white"/>
-        </w:rPr>
-        <w:t>Lambda_adminRole</w:t>
-      </w:r>
-      <w:proofErr w:type="spellEnd"/>
     </w:p>
     <w:p>
       <w:pPr>
@@ -375,37 +364,25 @@
               <w:jc w:val="both"/>
             </w:pPr>
             <w:r>
-              <w:t xml:space="preserve">import </w:t>
-            </w:r>
-            <w:proofErr w:type="spellStart"/>
-            <w:r>
-              <w:t>json</w:t>
-            </w:r>
-            <w:proofErr w:type="spellEnd"/>
-          </w:p>
-          <w:p>
-            <w:pPr>
-              <w:widowControl w:val="0"/>
-              <w:pBdr>
-                <w:top w:val="nil"/>
-                <w:left w:val="nil"/>
-                <w:bottom w:val="nil"/>
-                <w:right w:val="nil"/>
-                <w:between w:val="nil"/>
-              </w:pBdr>
-              <w:spacing w:line="240" w:lineRule="auto"/>
-              <w:jc w:val="both"/>
-            </w:pPr>
-            <w:r>
-              <w:t xml:space="preserve">import </w:t>
-            </w:r>
-            <w:proofErr w:type="spellStart"/>
-            <w:proofErr w:type="gramStart"/>
-            <w:r>
-              <w:t>urllib.parse</w:t>
-            </w:r>
-            <w:proofErr w:type="spellEnd"/>
-            <w:proofErr w:type="gramEnd"/>
+              <w:t>import json</w:t>
+            </w:r>
+          </w:p>
+          <w:p>
+            <w:pPr>
+              <w:widowControl w:val="0"/>
+              <w:pBdr>
+                <w:top w:val="nil"/>
+                <w:left w:val="nil"/>
+                <w:bottom w:val="nil"/>
+                <w:right w:val="nil"/>
+                <w:between w:val="nil"/>
+              </w:pBdr>
+              <w:spacing w:line="240" w:lineRule="auto"/>
+              <w:jc w:val="both"/>
+            </w:pPr>
+            <w:r>
+              <w:t>import urllib.parse</w:t>
+            </w:r>
           </w:p>
           <w:p>
             <w:pPr>
@@ -451,13 +428,8 @@
               <w:spacing w:line="240" w:lineRule="auto"/>
               <w:jc w:val="both"/>
             </w:pPr>
-            <w:proofErr w:type="gramStart"/>
-            <w:r>
-              <w:t>print(</w:t>
-            </w:r>
-            <w:proofErr w:type="gramEnd"/>
-            <w:r>
-              <w:t>'Loading function')</w:t>
+            <w:r>
+              <w:t>print('Loading function')</w:t>
             </w:r>
           </w:p>
           <w:p>
@@ -533,58 +505,24 @@
               <w:jc w:val="both"/>
             </w:pPr>
             <w:r>
-              <w:t xml:space="preserve">def </w:t>
-            </w:r>
-            <w:proofErr w:type="spellStart"/>
-            <w:r>
-              <w:t>lambda_</w:t>
-            </w:r>
-            <w:proofErr w:type="gramStart"/>
-            <w:r>
-              <w:t>handler</w:t>
-            </w:r>
-            <w:proofErr w:type="spellEnd"/>
-            <w:r>
-              <w:t>(</w:t>
-            </w:r>
-            <w:proofErr w:type="gramEnd"/>
-            <w:r>
-              <w:t>event, context):</w:t>
-            </w:r>
-          </w:p>
-          <w:p>
-            <w:pPr>
-              <w:widowControl w:val="0"/>
-              <w:pBdr>
-                <w:top w:val="nil"/>
-                <w:left w:val="nil"/>
-                <w:bottom w:val="nil"/>
-                <w:right w:val="nil"/>
-                <w:between w:val="nil"/>
-              </w:pBdr>
-              <w:spacing w:line="240" w:lineRule="auto"/>
-              <w:jc w:val="both"/>
-            </w:pPr>
-            <w:r>
-              <w:t xml:space="preserve">    #</w:t>
-            </w:r>
-            <w:proofErr w:type="gramStart"/>
-            <w:r>
-              <w:t>print(</w:t>
-            </w:r>
-            <w:proofErr w:type="gramEnd"/>
-            <w:r>
-              <w:t xml:space="preserve">"Received event: " + </w:t>
-            </w:r>
-            <w:proofErr w:type="spellStart"/>
-            <w:proofErr w:type="gramStart"/>
-            <w:r>
-              <w:t>json.dumps</w:t>
-            </w:r>
-            <w:proofErr w:type="spellEnd"/>
-            <w:proofErr w:type="gramEnd"/>
-            <w:r>
-              <w:t>(event, indent=2))</w:t>
+              <w:t>def lambda_handler(event, context):</w:t>
+            </w:r>
+          </w:p>
+          <w:p>
+            <w:pPr>
+              <w:widowControl w:val="0"/>
+              <w:pBdr>
+                <w:top w:val="nil"/>
+                <w:left w:val="nil"/>
+                <w:bottom w:val="nil"/>
+                <w:right w:val="nil"/>
+                <w:between w:val="nil"/>
+              </w:pBdr>
+              <w:spacing w:line="240" w:lineRule="auto"/>
+              <w:jc w:val="both"/>
+            </w:pPr>
+            <w:r>
+              <w:t xml:space="preserve">    #print("Received event: " + json.dumps(event, indent=2))</w:t>
             </w:r>
           </w:p>
           <w:p>
@@ -632,80 +570,24 @@
               <w:jc w:val="both"/>
             </w:pPr>
             <w:r>
-              <w:t xml:space="preserve">    bucket = event['Records'][</w:t>
-            </w:r>
-            <w:proofErr w:type="gramStart"/>
-            <w:r>
-              <w:t>0][</w:t>
-            </w:r>
-            <w:proofErr w:type="gramEnd"/>
-            <w:r>
-              <w:t>'s3</w:t>
-            </w:r>
-            <w:proofErr w:type="gramStart"/>
-            <w:r>
-              <w:t>'][</w:t>
-            </w:r>
-            <w:proofErr w:type="gramEnd"/>
-            <w:r>
-              <w:t>'bucket</w:t>
-            </w:r>
-            <w:proofErr w:type="gramStart"/>
-            <w:r>
-              <w:t>'][</w:t>
-            </w:r>
-            <w:proofErr w:type="gramEnd"/>
-            <w:r>
-              <w:t>'name']</w:t>
-            </w:r>
-          </w:p>
-          <w:p>
-            <w:pPr>
-              <w:widowControl w:val="0"/>
-              <w:pBdr>
-                <w:top w:val="nil"/>
-                <w:left w:val="nil"/>
-                <w:bottom w:val="nil"/>
-                <w:right w:val="nil"/>
-                <w:between w:val="nil"/>
-              </w:pBdr>
-              <w:spacing w:line="240" w:lineRule="auto"/>
-              <w:jc w:val="both"/>
-            </w:pPr>
-            <w:r>
-              <w:t xml:space="preserve">    key = </w:t>
-            </w:r>
-            <w:proofErr w:type="gramStart"/>
-            <w:r>
-              <w:t>urllib.parse</w:t>
-            </w:r>
-            <w:proofErr w:type="gramEnd"/>
-            <w:r>
-              <w:t>.unquote_plus(event['Records'][</w:t>
-            </w:r>
-            <w:proofErr w:type="gramStart"/>
-            <w:r>
-              <w:t>0][</w:t>
-            </w:r>
-            <w:proofErr w:type="gramEnd"/>
-            <w:r>
-              <w:t>'s3</w:t>
-            </w:r>
-            <w:proofErr w:type="gramStart"/>
-            <w:r>
-              <w:t>'][</w:t>
-            </w:r>
-            <w:proofErr w:type="gramEnd"/>
-            <w:r>
-              <w:t>'object</w:t>
-            </w:r>
-            <w:proofErr w:type="gramStart"/>
-            <w:r>
-              <w:t>'][</w:t>
-            </w:r>
-            <w:proofErr w:type="gramEnd"/>
-            <w:r>
-              <w:t>'key'], encoding='utf-8')</w:t>
+              <w:t xml:space="preserve">    bucket = event['Records'][0]['s3']['bucket']['name']</w:t>
+            </w:r>
+          </w:p>
+          <w:p>
+            <w:pPr>
+              <w:widowControl w:val="0"/>
+              <w:pBdr>
+                <w:top w:val="nil"/>
+                <w:left w:val="nil"/>
+                <w:bottom w:val="nil"/>
+                <w:right w:val="nil"/>
+                <w:between w:val="nil"/>
+              </w:pBdr>
+              <w:spacing w:line="240" w:lineRule="auto"/>
+              <w:jc w:val="both"/>
+            </w:pPr>
+            <w:r>
+              <w:t xml:space="preserve">    key = urllib.parse.unquote_plus(event['Records'][0]['s3']['object']['key'], encoding='utf-8')</w:t>
             </w:r>
           </w:p>
           <w:p>
@@ -739,15 +621,24 @@
               <w:jc w:val="both"/>
             </w:pPr>
             <w:r>
-              <w:t xml:space="preserve">        response = s3.get_</w:t>
-            </w:r>
-            <w:proofErr w:type="gramStart"/>
-            <w:r>
-              <w:t>object(</w:t>
-            </w:r>
-            <w:proofErr w:type="gramEnd"/>
-            <w:r>
-              <w:t>Bucket=bucket, Key=key)</w:t>
+              <w:t xml:space="preserve">        response = s3.get_object(Bucket=bucket, Key=key)</w:t>
+            </w:r>
+          </w:p>
+          <w:p>
+            <w:pPr>
+              <w:widowControl w:val="0"/>
+              <w:pBdr>
+                <w:top w:val="nil"/>
+                <w:left w:val="nil"/>
+                <w:bottom w:val="nil"/>
+                <w:right w:val="nil"/>
+                <w:between w:val="nil"/>
+              </w:pBdr>
+              <w:spacing w:line="240" w:lineRule="auto"/>
+              <w:jc w:val="both"/>
+            </w:pPr>
+            <w:r>
+              <w:t xml:space="preserve">        print("CONTENT TYPE: " + response['ContentType'])</w:t>
             </w:r>
           </w:p>
           <w:p>
@@ -766,113 +657,56 @@
             <w:r>
               <w:t xml:space="preserve">        </w:t>
             </w:r>
-            <w:proofErr w:type="gramStart"/>
-            <w:r>
-              <w:t>print(</w:t>
-            </w:r>
-            <w:proofErr w:type="gramEnd"/>
-            <w:r>
-              <w:t>"CONTENT TYPE: " + response['</w:t>
-            </w:r>
-            <w:proofErr w:type="spellStart"/>
-            <w:r>
-              <w:t>ContentType</w:t>
-            </w:r>
-            <w:proofErr w:type="spellEnd"/>
-            <w:r>
-              <w:t>'])</w:t>
-            </w:r>
-          </w:p>
-          <w:p>
-            <w:pPr>
-              <w:widowControl w:val="0"/>
-              <w:pBdr>
-                <w:top w:val="nil"/>
-                <w:left w:val="nil"/>
-                <w:bottom w:val="nil"/>
-                <w:right w:val="nil"/>
-                <w:between w:val="nil"/>
-              </w:pBdr>
-              <w:spacing w:line="240" w:lineRule="auto"/>
-              <w:jc w:val="both"/>
-            </w:pPr>
-            <w:r>
-              <w:t xml:space="preserve">        </w:t>
-            </w:r>
-          </w:p>
-          <w:p>
-            <w:pPr>
-              <w:widowControl w:val="0"/>
-              <w:pBdr>
-                <w:top w:val="nil"/>
-                <w:left w:val="nil"/>
-                <w:bottom w:val="nil"/>
-                <w:right w:val="nil"/>
-                <w:between w:val="nil"/>
-              </w:pBdr>
-              <w:spacing w:line="240" w:lineRule="auto"/>
-              <w:jc w:val="both"/>
-            </w:pPr>
-            <w:r>
-              <w:t xml:space="preserve">        </w:t>
-            </w:r>
-            <w:proofErr w:type="gramStart"/>
-            <w:r>
-              <w:t>print(</w:t>
-            </w:r>
-            <w:proofErr w:type="gramEnd"/>
-            <w:r>
-              <w:t>"File Name: " + key)</w:t>
-            </w:r>
-          </w:p>
-          <w:p>
-            <w:pPr>
-              <w:widowControl w:val="0"/>
-              <w:pBdr>
-                <w:top w:val="nil"/>
-                <w:left w:val="nil"/>
-                <w:bottom w:val="nil"/>
-                <w:right w:val="nil"/>
-                <w:between w:val="nil"/>
-              </w:pBdr>
-              <w:spacing w:line="240" w:lineRule="auto"/>
-              <w:jc w:val="both"/>
-            </w:pPr>
-            <w:r>
-              <w:t xml:space="preserve">        </w:t>
-            </w:r>
-            <w:proofErr w:type="gramStart"/>
-            <w:r>
-              <w:t>print(</w:t>
-            </w:r>
-            <w:proofErr w:type="gramEnd"/>
-            <w:r>
-              <w:t>"bucket Name: " + bucket)</w:t>
-            </w:r>
-          </w:p>
-          <w:p>
-            <w:pPr>
-              <w:widowControl w:val="0"/>
-              <w:pBdr>
-                <w:top w:val="nil"/>
-                <w:left w:val="nil"/>
-                <w:bottom w:val="nil"/>
-                <w:right w:val="nil"/>
-                <w:between w:val="nil"/>
-              </w:pBdr>
-              <w:spacing w:line="240" w:lineRule="auto"/>
-              <w:jc w:val="both"/>
-            </w:pPr>
-            <w:r>
-              <w:t xml:space="preserve">        return response['</w:t>
-            </w:r>
-            <w:proofErr w:type="spellStart"/>
-            <w:r>
-              <w:t>ContentType</w:t>
-            </w:r>
-            <w:proofErr w:type="spellEnd"/>
-            <w:r>
-              <w:t>']</w:t>
+          </w:p>
+          <w:p>
+            <w:pPr>
+              <w:widowControl w:val="0"/>
+              <w:pBdr>
+                <w:top w:val="nil"/>
+                <w:left w:val="nil"/>
+                <w:bottom w:val="nil"/>
+                <w:right w:val="nil"/>
+                <w:between w:val="nil"/>
+              </w:pBdr>
+              <w:spacing w:line="240" w:lineRule="auto"/>
+              <w:jc w:val="both"/>
+            </w:pPr>
+            <w:r>
+              <w:t xml:space="preserve">        print("File Name: " + key)</w:t>
+            </w:r>
+          </w:p>
+          <w:p>
+            <w:pPr>
+              <w:widowControl w:val="0"/>
+              <w:pBdr>
+                <w:top w:val="nil"/>
+                <w:left w:val="nil"/>
+                <w:bottom w:val="nil"/>
+                <w:right w:val="nil"/>
+                <w:between w:val="nil"/>
+              </w:pBdr>
+              <w:spacing w:line="240" w:lineRule="auto"/>
+              <w:jc w:val="both"/>
+            </w:pPr>
+            <w:r>
+              <w:t xml:space="preserve">        print("bucket Name: " + bucket)</w:t>
+            </w:r>
+          </w:p>
+          <w:p>
+            <w:pPr>
+              <w:widowControl w:val="0"/>
+              <w:pBdr>
+                <w:top w:val="nil"/>
+                <w:left w:val="nil"/>
+                <w:bottom w:val="nil"/>
+                <w:right w:val="nil"/>
+                <w:between w:val="nil"/>
+              </w:pBdr>
+              <w:spacing w:line="240" w:lineRule="auto"/>
+              <w:jc w:val="both"/>
+            </w:pPr>
+            <w:r>
+              <w:t xml:space="preserve">        return response['ContentType']</w:t>
             </w:r>
           </w:p>
           <w:p>
@@ -923,28 +757,7 @@
               <w:jc w:val="both"/>
             </w:pPr>
             <w:r>
-              <w:t xml:space="preserve">        </w:t>
-            </w:r>
-            <w:proofErr w:type="gramStart"/>
-            <w:r>
-              <w:t>print(</w:t>
-            </w:r>
-            <w:proofErr w:type="gramEnd"/>
-            <w:r>
-              <w:t xml:space="preserve">'Error getting object {} from bucket {}. Make sure they exist and your bucket is in the same region as this </w:t>
-            </w:r>
-            <w:proofErr w:type="spellStart"/>
-            <w:r>
-              <w:t>function.</w:t>
-            </w:r>
-            <w:proofErr w:type="gramStart"/>
-            <w:r>
-              <w:t>'.format</w:t>
-            </w:r>
-            <w:proofErr w:type="spellEnd"/>
-            <w:proofErr w:type="gramEnd"/>
-            <w:r>
-              <w:t>(key, bucket))</w:t>
+              <w:t xml:space="preserve">        print('Error getting object {} from bucket {}. Make sure they exist and your bucket is in the same region as this function.'.format(key, bucket))</w:t>
             </w:r>
           </w:p>
           <w:p>
@@ -1171,128 +984,75 @@
               <w:jc w:val="both"/>
             </w:pPr>
             <w:r>
-              <w:t xml:space="preserve">      "</w:t>
-            </w:r>
-            <w:proofErr w:type="spellStart"/>
-            <w:r>
-              <w:t>eventVersion</w:t>
-            </w:r>
-            <w:proofErr w:type="spellEnd"/>
-            <w:r>
-              <w:t>": "2.0",</w:t>
-            </w:r>
-          </w:p>
-          <w:p>
-            <w:pPr>
-              <w:widowControl w:val="0"/>
-              <w:pBdr>
-                <w:top w:val="nil"/>
-                <w:left w:val="nil"/>
-                <w:bottom w:val="nil"/>
-                <w:right w:val="nil"/>
-                <w:between w:val="nil"/>
-              </w:pBdr>
-              <w:spacing w:line="240" w:lineRule="auto"/>
-              <w:jc w:val="both"/>
-            </w:pPr>
-            <w:r>
-              <w:t xml:space="preserve">      "</w:t>
-            </w:r>
-            <w:proofErr w:type="spellStart"/>
-            <w:r>
-              <w:t>eventSource</w:t>
-            </w:r>
-            <w:proofErr w:type="spellEnd"/>
-            <w:r>
-              <w:t>": "</w:t>
-            </w:r>
-            <w:proofErr w:type="gramStart"/>
-            <w:r>
-              <w:t>aws:s</w:t>
-            </w:r>
-            <w:proofErr w:type="gramEnd"/>
-            <w:r>
-              <w:t>3",</w:t>
-            </w:r>
-          </w:p>
-          <w:p>
-            <w:pPr>
-              <w:widowControl w:val="0"/>
-              <w:pBdr>
-                <w:top w:val="nil"/>
-                <w:left w:val="nil"/>
-                <w:bottom w:val="nil"/>
-                <w:right w:val="nil"/>
-                <w:between w:val="nil"/>
-              </w:pBdr>
-              <w:spacing w:line="240" w:lineRule="auto"/>
-              <w:jc w:val="both"/>
-            </w:pPr>
-            <w:r>
-              <w:t xml:space="preserve">      "</w:t>
-            </w:r>
-            <w:proofErr w:type="spellStart"/>
-            <w:r>
-              <w:t>awsRegion</w:t>
-            </w:r>
-            <w:proofErr w:type="spellEnd"/>
-            <w:r>
-              <w:t>": "us-east-1",</w:t>
-            </w:r>
-          </w:p>
-          <w:p>
-            <w:pPr>
-              <w:widowControl w:val="0"/>
-              <w:pBdr>
-                <w:top w:val="nil"/>
-                <w:left w:val="nil"/>
-                <w:bottom w:val="nil"/>
-                <w:right w:val="nil"/>
-                <w:between w:val="nil"/>
-              </w:pBdr>
-              <w:spacing w:line="240" w:lineRule="auto"/>
-              <w:jc w:val="both"/>
-            </w:pPr>
-            <w:r>
-              <w:t xml:space="preserve">      "</w:t>
-            </w:r>
-            <w:proofErr w:type="spellStart"/>
-            <w:r>
-              <w:t>eventTime</w:t>
-            </w:r>
-            <w:proofErr w:type="spellEnd"/>
-            <w:r>
-              <w:t>": "1970-01-01T00:00:00.000Z",</w:t>
-            </w:r>
-          </w:p>
-          <w:p>
-            <w:pPr>
-              <w:widowControl w:val="0"/>
-              <w:pBdr>
-                <w:top w:val="nil"/>
-                <w:left w:val="nil"/>
-                <w:bottom w:val="nil"/>
-                <w:right w:val="nil"/>
-                <w:between w:val="nil"/>
-              </w:pBdr>
-              <w:spacing w:line="240" w:lineRule="auto"/>
-              <w:jc w:val="both"/>
-            </w:pPr>
-            <w:r>
-              <w:t xml:space="preserve">      "</w:t>
-            </w:r>
-            <w:proofErr w:type="spellStart"/>
-            <w:r>
-              <w:t>eventName</w:t>
-            </w:r>
-            <w:proofErr w:type="spellEnd"/>
-            <w:r>
-              <w:t>": "</w:t>
-            </w:r>
-            <w:proofErr w:type="spellStart"/>
-            <w:proofErr w:type="gramStart"/>
-            <w:r>
-              <w:t>ObjectCreated:</w:t>
+              <w:t xml:space="preserve">      "eventVersion": "2.0",</w:t>
+            </w:r>
+          </w:p>
+          <w:p>
+            <w:pPr>
+              <w:widowControl w:val="0"/>
+              <w:pBdr>
+                <w:top w:val="nil"/>
+                <w:left w:val="nil"/>
+                <w:bottom w:val="nil"/>
+                <w:right w:val="nil"/>
+                <w:between w:val="nil"/>
+              </w:pBdr>
+              <w:spacing w:line="240" w:lineRule="auto"/>
+              <w:jc w:val="both"/>
+            </w:pPr>
+            <w:r>
+              <w:t xml:space="preserve">      "eventSource": "aws:s3",</w:t>
+            </w:r>
+          </w:p>
+          <w:p>
+            <w:pPr>
+              <w:widowControl w:val="0"/>
+              <w:pBdr>
+                <w:top w:val="nil"/>
+                <w:left w:val="nil"/>
+                <w:bottom w:val="nil"/>
+                <w:right w:val="nil"/>
+                <w:between w:val="nil"/>
+              </w:pBdr>
+              <w:spacing w:line="240" w:lineRule="auto"/>
+              <w:jc w:val="both"/>
+            </w:pPr>
+            <w:r>
+              <w:t xml:space="preserve">      "awsRegion": "us-east-1",</w:t>
+            </w:r>
+          </w:p>
+          <w:p>
+            <w:pPr>
+              <w:widowControl w:val="0"/>
+              <w:pBdr>
+                <w:top w:val="nil"/>
+                <w:left w:val="nil"/>
+                <w:bottom w:val="nil"/>
+                <w:right w:val="nil"/>
+                <w:between w:val="nil"/>
+              </w:pBdr>
+              <w:spacing w:line="240" w:lineRule="auto"/>
+              <w:jc w:val="both"/>
+            </w:pPr>
+            <w:r>
+              <w:t xml:space="preserve">      "eventTime": "1970-01-01T00:00:00.000Z",</w:t>
+            </w:r>
+          </w:p>
+          <w:p>
+            <w:pPr>
+              <w:widowControl w:val="0"/>
+              <w:pBdr>
+                <w:top w:val="nil"/>
+                <w:left w:val="nil"/>
+                <w:bottom w:val="nil"/>
+                <w:right w:val="nil"/>
+                <w:between w:val="nil"/>
+              </w:pBdr>
+              <w:spacing w:line="240" w:lineRule="auto"/>
+              <w:jc w:val="both"/>
+            </w:pPr>
+            <w:r>
+              <w:t xml:space="preserve">      "eventName": "ObjectCreated:</w:t>
             </w:r>
             <w:r>
               <w:rPr>
@@ -1300,8 +1060,6 @@
               </w:rPr>
               <w:t>Put</w:t>
             </w:r>
-            <w:proofErr w:type="spellEnd"/>
-            <w:proofErr w:type="gramEnd"/>
             <w:r>
               <w:t>",</w:t>
             </w:r>
@@ -1320,40 +1078,24 @@
               <w:jc w:val="both"/>
             </w:pPr>
             <w:r>
-              <w:t xml:space="preserve">      "</w:t>
-            </w:r>
-            <w:proofErr w:type="spellStart"/>
-            <w:r>
-              <w:t>userIdentity</w:t>
-            </w:r>
-            <w:proofErr w:type="spellEnd"/>
-            <w:r>
-              <w:t>": {</w:t>
-            </w:r>
-          </w:p>
-          <w:p>
-            <w:pPr>
-              <w:widowControl w:val="0"/>
-              <w:pBdr>
-                <w:top w:val="nil"/>
-                <w:left w:val="nil"/>
-                <w:bottom w:val="nil"/>
-                <w:right w:val="nil"/>
-                <w:between w:val="nil"/>
-              </w:pBdr>
-              <w:spacing w:line="240" w:lineRule="auto"/>
-              <w:jc w:val="both"/>
-            </w:pPr>
-            <w:r>
-              <w:t xml:space="preserve">        "</w:t>
-            </w:r>
-            <w:proofErr w:type="spellStart"/>
-            <w:r>
-              <w:t>principalId</w:t>
-            </w:r>
-            <w:proofErr w:type="spellEnd"/>
-            <w:r>
-              <w:t>": "EXAMPLE"</w:t>
+              <w:t xml:space="preserve">      "userIdentity": {</w:t>
+            </w:r>
+          </w:p>
+          <w:p>
+            <w:pPr>
+              <w:widowControl w:val="0"/>
+              <w:pBdr>
+                <w:top w:val="nil"/>
+                <w:left w:val="nil"/>
+                <w:bottom w:val="nil"/>
+                <w:right w:val="nil"/>
+                <w:between w:val="nil"/>
+              </w:pBdr>
+              <w:spacing w:line="240" w:lineRule="auto"/>
+              <w:jc w:val="both"/>
+            </w:pPr>
+            <w:r>
+              <w:t xml:space="preserve">        "principalId": "EXAMPLE"</w:t>
             </w:r>
           </w:p>
           <w:p>
@@ -1387,40 +1129,24 @@
               <w:jc w:val="both"/>
             </w:pPr>
             <w:r>
-              <w:t xml:space="preserve">      "</w:t>
-            </w:r>
-            <w:proofErr w:type="spellStart"/>
-            <w:r>
-              <w:t>requestParameters</w:t>
-            </w:r>
-            <w:proofErr w:type="spellEnd"/>
-            <w:r>
-              <w:t>": {</w:t>
-            </w:r>
-          </w:p>
-          <w:p>
-            <w:pPr>
-              <w:widowControl w:val="0"/>
-              <w:pBdr>
-                <w:top w:val="nil"/>
-                <w:left w:val="nil"/>
-                <w:bottom w:val="nil"/>
-                <w:right w:val="nil"/>
-                <w:between w:val="nil"/>
-              </w:pBdr>
-              <w:spacing w:line="240" w:lineRule="auto"/>
-              <w:jc w:val="both"/>
-            </w:pPr>
-            <w:r>
-              <w:t xml:space="preserve">        "</w:t>
-            </w:r>
-            <w:proofErr w:type="spellStart"/>
-            <w:r>
-              <w:t>sourceIPAddress</w:t>
-            </w:r>
-            <w:proofErr w:type="spellEnd"/>
-            <w:r>
-              <w:t>": "127.0.0.1"</w:t>
+              <w:t xml:space="preserve">      "requestParameters": {</w:t>
+            </w:r>
+          </w:p>
+          <w:p>
+            <w:pPr>
+              <w:widowControl w:val="0"/>
+              <w:pBdr>
+                <w:top w:val="nil"/>
+                <w:left w:val="nil"/>
+                <w:bottom w:val="nil"/>
+                <w:right w:val="nil"/>
+                <w:between w:val="nil"/>
+              </w:pBdr>
+              <w:spacing w:line="240" w:lineRule="auto"/>
+              <w:jc w:val="both"/>
+            </w:pPr>
+            <w:r>
+              <w:t xml:space="preserve">        "sourceIPAddress": "127.0.0.1"</w:t>
             </w:r>
           </w:p>
           <w:p>
@@ -1454,40 +1180,24 @@
               <w:jc w:val="both"/>
             </w:pPr>
             <w:r>
-              <w:t xml:space="preserve">      "</w:t>
-            </w:r>
-            <w:proofErr w:type="spellStart"/>
-            <w:r>
-              <w:t>responseElements</w:t>
-            </w:r>
-            <w:proofErr w:type="spellEnd"/>
-            <w:r>
-              <w:t>": {</w:t>
-            </w:r>
-          </w:p>
-          <w:p>
-            <w:pPr>
-              <w:widowControl w:val="0"/>
-              <w:pBdr>
-                <w:top w:val="nil"/>
-                <w:left w:val="nil"/>
-                <w:bottom w:val="nil"/>
-                <w:right w:val="nil"/>
-                <w:between w:val="nil"/>
-              </w:pBdr>
-              <w:spacing w:line="240" w:lineRule="auto"/>
-              <w:jc w:val="both"/>
-            </w:pPr>
-            <w:r>
-              <w:t xml:space="preserve">        "x-</w:t>
-            </w:r>
-            <w:proofErr w:type="spellStart"/>
-            <w:r>
-              <w:t>amz</w:t>
-            </w:r>
-            <w:proofErr w:type="spellEnd"/>
-            <w:r>
-              <w:t>-request-id": "EXAMPLE123456789",</w:t>
+              <w:t xml:space="preserve">      "responseElements": {</w:t>
+            </w:r>
+          </w:p>
+          <w:p>
+            <w:pPr>
+              <w:widowControl w:val="0"/>
+              <w:pBdr>
+                <w:top w:val="nil"/>
+                <w:left w:val="nil"/>
+                <w:bottom w:val="nil"/>
+                <w:right w:val="nil"/>
+                <w:between w:val="nil"/>
+              </w:pBdr>
+              <w:spacing w:line="240" w:lineRule="auto"/>
+              <w:jc w:val="both"/>
+            </w:pPr>
+            <w:r>
+              <w:t xml:space="preserve">        "x-amz-request-id": "EXAMPLE123456789",</w:t>
             </w:r>
           </w:p>
           <w:p>
@@ -1572,23 +1282,7 @@
               <w:jc w:val="both"/>
             </w:pPr>
             <w:r>
-              <w:t xml:space="preserve">        "</w:t>
-            </w:r>
-            <w:proofErr w:type="spellStart"/>
-            <w:r>
-              <w:t>configurationId</w:t>
-            </w:r>
-            <w:proofErr w:type="spellEnd"/>
-            <w:r>
-              <w:t>": "</w:t>
-            </w:r>
-            <w:proofErr w:type="spellStart"/>
-            <w:r>
-              <w:t>testConfigRule</w:t>
-            </w:r>
-            <w:proofErr w:type="spellEnd"/>
-            <w:r>
-              <w:t>",</w:t>
+              <w:t xml:space="preserve">        "configurationId": "testConfigRule",</w:t>
             </w:r>
           </w:p>
           <w:p>
@@ -1648,40 +1342,24 @@
               <w:jc w:val="both"/>
             </w:pPr>
             <w:r>
-              <w:t xml:space="preserve">          "</w:t>
-            </w:r>
-            <w:proofErr w:type="spellStart"/>
-            <w:r>
-              <w:t>ownerIdentity</w:t>
-            </w:r>
-            <w:proofErr w:type="spellEnd"/>
-            <w:r>
-              <w:t>": {</w:t>
-            </w:r>
-          </w:p>
-          <w:p>
-            <w:pPr>
-              <w:widowControl w:val="0"/>
-              <w:pBdr>
-                <w:top w:val="nil"/>
-                <w:left w:val="nil"/>
-                <w:bottom w:val="nil"/>
-                <w:right w:val="nil"/>
-                <w:between w:val="nil"/>
-              </w:pBdr>
-              <w:spacing w:line="240" w:lineRule="auto"/>
-              <w:jc w:val="both"/>
-            </w:pPr>
-            <w:r>
-              <w:t xml:space="preserve">            "</w:t>
-            </w:r>
-            <w:proofErr w:type="spellStart"/>
-            <w:r>
-              <w:t>principalId</w:t>
-            </w:r>
-            <w:proofErr w:type="spellEnd"/>
-            <w:r>
-              <w:t>": "EXAMPLE"</w:t>
+              <w:t xml:space="preserve">          "ownerIdentity": {</w:t>
+            </w:r>
+          </w:p>
+          <w:p>
+            <w:pPr>
+              <w:widowControl w:val="0"/>
+              <w:pBdr>
+                <w:top w:val="nil"/>
+                <w:left w:val="nil"/>
+                <w:bottom w:val="nil"/>
+                <w:right w:val="nil"/>
+                <w:between w:val="nil"/>
+              </w:pBdr>
+              <w:spacing w:line="240" w:lineRule="auto"/>
+              <w:jc w:val="both"/>
+            </w:pPr>
+            <w:r>
+              <w:t xml:space="preserve">            "principalId": "EXAMPLE"</w:t>
             </w:r>
           </w:p>
           <w:p>
@@ -1715,29 +1393,8 @@
               <w:jc w:val="both"/>
             </w:pPr>
             <w:r>
-              <w:t xml:space="preserve">          "</w:t>
-            </w:r>
-            <w:proofErr w:type="spellStart"/>
-            <w:r>
-              <w:t>arn</w:t>
-            </w:r>
-            <w:proofErr w:type="spellEnd"/>
-            <w:r>
-              <w:t>": "</w:t>
-            </w:r>
-            <w:proofErr w:type="gramStart"/>
-            <w:r>
-              <w:t>arn:aws</w:t>
-            </w:r>
-            <w:proofErr w:type="gramEnd"/>
-            <w:r>
-              <w:t>:s</w:t>
-            </w:r>
-            <w:proofErr w:type="gramStart"/>
-            <w:r>
-              <w:t>3:::</w:t>
-            </w:r>
-            <w:proofErr w:type="gramEnd"/>
+              <w:t xml:space="preserve">          "arn": "arn:aws:s3:::</w:t>
+            </w:r>
             <w:r>
               <w:rPr>
                 <w:b/>
@@ -1982,6 +1639,512 @@
       <w:r>
         <w:t>save above code and deploy and test.</w:t>
       </w:r>
+    </w:p>
+    <w:p>
+      <w:pPr>
+        <w:numPr>
+          <w:ilvl w:val="0"/>
+          <w:numId w:val="2"/>
+        </w:numPr>
+        <w:jc w:val="both"/>
+      </w:pPr>
+      <w:r>
+        <w:t>Lambda to start glue job on s3 put.</w:t>
+      </w:r>
+    </w:p>
+    <w:p>
+      <w:pPr>
+        <w:jc w:val="both"/>
+      </w:pPr>
+    </w:p>
+    <w:p>
+      <w:pPr>
+        <w:jc w:val="both"/>
+      </w:pPr>
+      <w:r>
+        <w:t>Create a lambda function from scratch and add a role.</w:t>
+      </w:r>
+    </w:p>
+    <w:p>
+      <w:pPr>
+        <w:jc w:val="both"/>
+      </w:pPr>
+      <w:r>
+        <w:t>Add the s3 trigger described above.</w:t>
+      </w:r>
+    </w:p>
+    <w:p>
+      <w:pPr>
+        <w:jc w:val="both"/>
+      </w:pPr>
+    </w:p>
+    <w:p>
+      <w:pPr>
+        <w:jc w:val="both"/>
+      </w:pPr>
+      <w:r>
+        <w:t>copy below code in code section</w:t>
+      </w:r>
+    </w:p>
+    <w:p>
+      <w:pPr>
+        <w:jc w:val="both"/>
+      </w:pPr>
+      <w:r>
+        <w:t xml:space="preserve">And replace </w:t>
+      </w:r>
+      <w:r>
+        <w:rPr>
+          <w:b/>
+        </w:rPr>
+        <w:t xml:space="preserve">csv_non_parts_toORC </w:t>
+      </w:r>
+      <w:r>
+        <w:t>with your glue job.</w:t>
+      </w:r>
+    </w:p>
+    <w:p>
+      <w:pPr>
+        <w:jc w:val="both"/>
+      </w:pPr>
+    </w:p>
+    <w:tbl>
+      <w:tblPr>
+        <w:tblW w:w="9029" w:type="dxa"/>
+        <w:tblBorders>
+          <w:top w:val="single" w:sz="8" w:space="0" w:color="000000"/>
+          <w:left w:val="single" w:sz="8" w:space="0" w:color="000000"/>
+          <w:bottom w:val="single" w:sz="8" w:space="0" w:color="000000"/>
+          <w:right w:val="single" w:sz="8" w:space="0" w:color="000000"/>
+          <w:insideH w:val="single" w:sz="8" w:space="0" w:color="000000"/>
+          <w:insideV w:val="single" w:sz="8" w:space="0" w:color="000000"/>
+        </w:tblBorders>
+        <w:tblLayout w:type="fixed"/>
+        <w:tblLook w:val="0600" w:firstRow="0" w:lastRow="0" w:firstColumn="0" w:lastColumn="0" w:noHBand="1" w:noVBand="1"/>
+      </w:tblPr>
+      <w:tblGrid>
+        <w:gridCol w:w="9029"/>
+      </w:tblGrid>
+      <w:tr>
+        <w:tc>
+          <w:tcPr>
+            <w:tcW w:w="9029" w:type="dxa"/>
+            <w:tcMar>
+              <w:top w:w="100" w:type="dxa"/>
+              <w:left w:w="100" w:type="dxa"/>
+              <w:bottom w:w="100" w:type="dxa"/>
+              <w:right w:w="100" w:type="dxa"/>
+            </w:tcMar>
+          </w:tcPr>
+          <w:p>
+            <w:pPr>
+              <w:widowControl w:val="0"/>
+              <w:pBdr>
+                <w:top w:val="nil"/>
+                <w:left w:val="nil"/>
+                <w:bottom w:val="nil"/>
+                <w:right w:val="nil"/>
+                <w:between w:val="nil"/>
+              </w:pBdr>
+              <w:spacing w:line="240" w:lineRule="auto"/>
+            </w:pPr>
+            <w:r>
+              <w:t>import json</w:t>
+            </w:r>
+          </w:p>
+          <w:p>
+            <w:pPr>
+              <w:widowControl w:val="0"/>
+              <w:pBdr>
+                <w:top w:val="nil"/>
+                <w:left w:val="nil"/>
+                <w:bottom w:val="nil"/>
+                <w:right w:val="nil"/>
+                <w:between w:val="nil"/>
+              </w:pBdr>
+              <w:spacing w:line="240" w:lineRule="auto"/>
+            </w:pPr>
+            <w:r>
+              <w:t>import os</w:t>
+            </w:r>
+          </w:p>
+          <w:p>
+            <w:pPr>
+              <w:widowControl w:val="0"/>
+              <w:pBdr>
+                <w:top w:val="nil"/>
+                <w:left w:val="nil"/>
+                <w:bottom w:val="nil"/>
+                <w:right w:val="nil"/>
+                <w:between w:val="nil"/>
+              </w:pBdr>
+              <w:spacing w:line="240" w:lineRule="auto"/>
+            </w:pPr>
+            <w:r>
+              <w:t>import logging</w:t>
+            </w:r>
+          </w:p>
+          <w:p>
+            <w:pPr>
+              <w:widowControl w:val="0"/>
+              <w:pBdr>
+                <w:top w:val="nil"/>
+                <w:left w:val="nil"/>
+                <w:bottom w:val="nil"/>
+                <w:right w:val="nil"/>
+                <w:between w:val="nil"/>
+              </w:pBdr>
+              <w:spacing w:line="240" w:lineRule="auto"/>
+            </w:pPr>
+            <w:r>
+              <w:t>logger = logging.getLogger()</w:t>
+            </w:r>
+          </w:p>
+          <w:p>
+            <w:pPr>
+              <w:widowControl w:val="0"/>
+              <w:pBdr>
+                <w:top w:val="nil"/>
+                <w:left w:val="nil"/>
+                <w:bottom w:val="nil"/>
+                <w:right w:val="nil"/>
+                <w:between w:val="nil"/>
+              </w:pBdr>
+              <w:spacing w:line="240" w:lineRule="auto"/>
+            </w:pPr>
+            <w:r>
+              <w:t>logger.setLevel(logging.INFO)</w:t>
+            </w:r>
+          </w:p>
+          <w:p>
+            <w:pPr>
+              <w:widowControl w:val="0"/>
+              <w:pBdr>
+                <w:top w:val="nil"/>
+                <w:left w:val="nil"/>
+                <w:bottom w:val="nil"/>
+                <w:right w:val="nil"/>
+                <w:between w:val="nil"/>
+              </w:pBdr>
+              <w:spacing w:line="240" w:lineRule="auto"/>
+            </w:pPr>
+          </w:p>
+          <w:p>
+            <w:pPr>
+              <w:widowControl w:val="0"/>
+              <w:pBdr>
+                <w:top w:val="nil"/>
+                <w:left w:val="nil"/>
+                <w:bottom w:val="nil"/>
+                <w:right w:val="nil"/>
+                <w:between w:val="nil"/>
+              </w:pBdr>
+              <w:spacing w:line="240" w:lineRule="auto"/>
+            </w:pPr>
+            <w:r>
+              <w:t># Import Boto 3 for AWS Glue</w:t>
+            </w:r>
+          </w:p>
+          <w:p>
+            <w:pPr>
+              <w:widowControl w:val="0"/>
+              <w:pBdr>
+                <w:top w:val="nil"/>
+                <w:left w:val="nil"/>
+                <w:bottom w:val="nil"/>
+                <w:right w:val="nil"/>
+                <w:between w:val="nil"/>
+              </w:pBdr>
+              <w:spacing w:line="240" w:lineRule="auto"/>
+            </w:pPr>
+            <w:r>
+              <w:t>import boto3</w:t>
+            </w:r>
+          </w:p>
+          <w:p>
+            <w:pPr>
+              <w:widowControl w:val="0"/>
+              <w:pBdr>
+                <w:top w:val="nil"/>
+                <w:left w:val="nil"/>
+                <w:bottom w:val="nil"/>
+                <w:right w:val="nil"/>
+                <w:between w:val="nil"/>
+              </w:pBdr>
+              <w:spacing w:line="240" w:lineRule="auto"/>
+            </w:pPr>
+            <w:r>
+              <w:t>client = boto3.client('glue')</w:t>
+            </w:r>
+          </w:p>
+          <w:p>
+            <w:pPr>
+              <w:widowControl w:val="0"/>
+              <w:pBdr>
+                <w:top w:val="nil"/>
+                <w:left w:val="nil"/>
+                <w:bottom w:val="nil"/>
+                <w:right w:val="nil"/>
+                <w:between w:val="nil"/>
+              </w:pBdr>
+              <w:spacing w:line="240" w:lineRule="auto"/>
+            </w:pPr>
+          </w:p>
+          <w:p>
+            <w:pPr>
+              <w:widowControl w:val="0"/>
+              <w:pBdr>
+                <w:top w:val="nil"/>
+                <w:left w:val="nil"/>
+                <w:bottom w:val="nil"/>
+                <w:right w:val="nil"/>
+                <w:between w:val="nil"/>
+              </w:pBdr>
+              <w:spacing w:line="240" w:lineRule="auto"/>
+            </w:pPr>
+            <w:r>
+              <w:t xml:space="preserve"># Variables for the job: </w:t>
+            </w:r>
+          </w:p>
+          <w:p>
+            <w:pPr>
+              <w:widowControl w:val="0"/>
+              <w:pBdr>
+                <w:top w:val="nil"/>
+                <w:left w:val="nil"/>
+                <w:bottom w:val="nil"/>
+                <w:right w:val="nil"/>
+                <w:between w:val="nil"/>
+              </w:pBdr>
+              <w:spacing w:line="240" w:lineRule="auto"/>
+              <w:rPr>
+                <w:b/>
+              </w:rPr>
+            </w:pPr>
+            <w:r>
+              <w:t xml:space="preserve">glueJobName = </w:t>
+            </w:r>
+            <w:r>
+              <w:rPr>
+                <w:b/>
+              </w:rPr>
+              <w:t>"csv_non_parts_toORC"</w:t>
+            </w:r>
+          </w:p>
+          <w:p>
+            <w:pPr>
+              <w:widowControl w:val="0"/>
+              <w:pBdr>
+                <w:top w:val="nil"/>
+                <w:left w:val="nil"/>
+                <w:bottom w:val="nil"/>
+                <w:right w:val="nil"/>
+                <w:between w:val="nil"/>
+              </w:pBdr>
+              <w:spacing w:line="240" w:lineRule="auto"/>
+            </w:pPr>
+          </w:p>
+          <w:p>
+            <w:pPr>
+              <w:widowControl w:val="0"/>
+              <w:pBdr>
+                <w:top w:val="nil"/>
+                <w:left w:val="nil"/>
+                <w:bottom w:val="nil"/>
+                <w:right w:val="nil"/>
+                <w:between w:val="nil"/>
+              </w:pBdr>
+              <w:spacing w:line="240" w:lineRule="auto"/>
+            </w:pPr>
+            <w:r>
+              <w:t># Define Lambda function</w:t>
+            </w:r>
+          </w:p>
+          <w:p>
+            <w:pPr>
+              <w:widowControl w:val="0"/>
+              <w:pBdr>
+                <w:top w:val="nil"/>
+                <w:left w:val="nil"/>
+                <w:bottom w:val="nil"/>
+                <w:right w:val="nil"/>
+                <w:between w:val="nil"/>
+              </w:pBdr>
+              <w:spacing w:line="240" w:lineRule="auto"/>
+            </w:pPr>
+            <w:r>
+              <w:t>def lambda_handler(event, context):</w:t>
+            </w:r>
+          </w:p>
+          <w:p>
+            <w:pPr>
+              <w:widowControl w:val="0"/>
+              <w:pBdr>
+                <w:top w:val="nil"/>
+                <w:left w:val="nil"/>
+                <w:bottom w:val="nil"/>
+                <w:right w:val="nil"/>
+                <w:between w:val="nil"/>
+              </w:pBdr>
+              <w:spacing w:line="240" w:lineRule="auto"/>
+            </w:pPr>
+            <w:r>
+              <w:t xml:space="preserve">    logger.info('## INITIATED BY EVENT: ')</w:t>
+            </w:r>
+          </w:p>
+          <w:p>
+            <w:pPr>
+              <w:widowControl w:val="0"/>
+              <w:pBdr>
+                <w:top w:val="nil"/>
+                <w:left w:val="nil"/>
+                <w:bottom w:val="nil"/>
+                <w:right w:val="nil"/>
+                <w:between w:val="nil"/>
+              </w:pBdr>
+              <w:spacing w:line="240" w:lineRule="auto"/>
+            </w:pPr>
+            <w:r>
+              <w:t xml:space="preserve">   </w:t>
+            </w:r>
+          </w:p>
+          <w:p>
+            <w:pPr>
+              <w:widowControl w:val="0"/>
+              <w:pBdr>
+                <w:top w:val="nil"/>
+                <w:left w:val="nil"/>
+                <w:bottom w:val="nil"/>
+                <w:right w:val="nil"/>
+                <w:between w:val="nil"/>
+              </w:pBdr>
+              <w:spacing w:line="240" w:lineRule="auto"/>
+            </w:pPr>
+            <w:r>
+              <w:t xml:space="preserve">    response = client.start_job_run(JobName = glueJobName)</w:t>
+            </w:r>
+          </w:p>
+          <w:p>
+            <w:pPr>
+              <w:widowControl w:val="0"/>
+              <w:pBdr>
+                <w:top w:val="nil"/>
+                <w:left w:val="nil"/>
+                <w:bottom w:val="nil"/>
+                <w:right w:val="nil"/>
+                <w:between w:val="nil"/>
+              </w:pBdr>
+              <w:spacing w:line="240" w:lineRule="auto"/>
+            </w:pPr>
+            <w:r>
+              <w:t xml:space="preserve">    print(response)</w:t>
+            </w:r>
+          </w:p>
+          <w:p>
+            <w:pPr>
+              <w:widowControl w:val="0"/>
+              <w:pBdr>
+                <w:top w:val="nil"/>
+                <w:left w:val="nil"/>
+                <w:bottom w:val="nil"/>
+                <w:right w:val="nil"/>
+                <w:between w:val="nil"/>
+              </w:pBdr>
+              <w:spacing w:line="240" w:lineRule="auto"/>
+            </w:pPr>
+            <w:r>
+              <w:t xml:space="preserve">    logger.info('## STARTED GLUE JOB: ' + glueJobName)</w:t>
+            </w:r>
+          </w:p>
+          <w:p>
+            <w:pPr>
+              <w:widowControl w:val="0"/>
+              <w:pBdr>
+                <w:top w:val="nil"/>
+                <w:left w:val="nil"/>
+                <w:bottom w:val="nil"/>
+                <w:right w:val="nil"/>
+                <w:between w:val="nil"/>
+              </w:pBdr>
+              <w:spacing w:line="240" w:lineRule="auto"/>
+            </w:pPr>
+            <w:r>
+              <w:t xml:space="preserve">    logger.info('## GLUE JOB RUN ID: ' + response['JobRunId'])</w:t>
+            </w:r>
+          </w:p>
+          <w:p>
+            <w:pPr>
+              <w:widowControl w:val="0"/>
+              <w:pBdr>
+                <w:top w:val="nil"/>
+                <w:left w:val="nil"/>
+                <w:bottom w:val="nil"/>
+                <w:right w:val="nil"/>
+                <w:between w:val="nil"/>
+              </w:pBdr>
+              <w:spacing w:line="240" w:lineRule="auto"/>
+            </w:pPr>
+            <w:r>
+              <w:t xml:space="preserve">    return response</w:t>
+            </w:r>
+          </w:p>
+          <w:p>
+            <w:pPr>
+              <w:widowControl w:val="0"/>
+              <w:pBdr>
+                <w:top w:val="nil"/>
+                <w:left w:val="nil"/>
+                <w:bottom w:val="nil"/>
+                <w:right w:val="nil"/>
+                <w:between w:val="nil"/>
+              </w:pBdr>
+              <w:spacing w:line="240" w:lineRule="auto"/>
+            </w:pPr>
+          </w:p>
+        </w:tc>
+      </w:tr>
+    </w:tbl>
+    <w:p>
+      <w:pPr>
+        <w:jc w:val="both"/>
+      </w:pPr>
+    </w:p>
+    <w:p>
+      <w:pPr>
+        <w:jc w:val="both"/>
+        <w:rPr>
+          <w:sz w:val="24"/>
+          <w:szCs w:val="24"/>
+        </w:rPr>
+      </w:pPr>
+      <w:r>
+        <w:rPr>
+          <w:sz w:val="24"/>
+          <w:szCs w:val="24"/>
+        </w:rPr>
+        <w:t>Deploy this code and test.</w:t>
+      </w:r>
+    </w:p>
+    <w:p>
+      <w:pPr>
+        <w:jc w:val="both"/>
+        <w:rPr>
+          <w:sz w:val="24"/>
+          <w:szCs w:val="24"/>
+        </w:rPr>
+      </w:pPr>
+      <w:r>
+        <w:rPr>
+          <w:sz w:val="24"/>
+          <w:szCs w:val="24"/>
+        </w:rPr>
+        <w:t>You can see a job running at the glue console.</w:t>
+      </w:r>
+    </w:p>
+    <w:p>
+      <w:pPr>
+        <w:jc w:val="both"/>
+      </w:pPr>
     </w:p>
     <w:p>
       <w:pPr>
@@ -2001,7 +2164,7 @@
 <file path=word/numbering.xml><?xml version="1.0" encoding="utf-8"?>
 <w:numbering xmlns:wpc="http://schemas.microsoft.com/office/word/2010/wordprocessingCanvas" xmlns:cx="http://schemas.microsoft.com/office/drawing/2014/chartex" xmlns:cx1="http://schemas.microsoft.com/office/drawing/2015/9/8/chartex" xmlns:cx2="http://schemas.microsoft.com/office/drawing/2015/10/21/chartex" xmlns:cx3="http://schemas.microsoft.com/office/drawing/2016/5/9/chartex" xmlns:cx4="http://schemas.microsoft.com/office/drawing/2016/5/10/chartex" xmlns:cx5="http://schemas.microsoft.com/office/drawing/2016/5/11/chartex" xmlns:cx6="http://schemas.microsoft.com/office/drawing/2016/5/12/chartex" xmlns:cx7="http://schemas.microsoft.com/office/drawing/2016/5/13/chartex" xmlns:cx8="http://schemas.microsoft.com/office/drawing/2016/5/14/chartex" xmlns:mc="http://schemas.openxmlformats.org/markup-compatibility/2006" xmlns:aink="http://schemas.microsoft.com/office/drawing/2016/ink" xmlns:am3d="http://schemas.microsoft.com/office/drawing/2017/model3d" xmlns:o="urn:schemas-microsoft-com:office:office" xmlns:oel="http://schemas.microsoft.com/office/2019/extlst" xmlns:r="http://schemas.openxmlformats.org/officeDocument/2006/relationships" xmlns:m="http://schemas.openxmlformats.org/officeDocument/2006/math" xmlns:v="urn:schemas-microsoft-com:vml" xmlns:wp14="http://schemas.microsoft.com/office/word/2010/wordprocessingDrawing" xmlns:wp="http://schemas.openxmlformats.org/drawingml/2006/wordprocessingDrawing" xmlns:w10="urn:schemas-microsoft-com:office:word" xmlns:w="http://schemas.openxmlformats.org/wordprocessingml/2006/main" xmlns:w14="http://schemas.microsoft.com/office/word/2010/wordml" xmlns:w15="http://schemas.microsoft.com/office/word/2012/wordml" xmlns:w16cex="http://schemas.microsoft.com/office/word/2018/wordml/cex" xmlns:w16cid="http://schemas.microsoft.com/office/word/2016/wordml/cid" xmlns:w16="http://schemas.microsoft.com/office/word/2018/wordml" xmlns:w16du="http://schemas.microsoft.com/office/word/2023/wordml/word16du" xmlns:w16sdtdh="http://schemas.microsoft.com/office/word/2020/wordml/sdtdatahash" xmlns:w16sdtfl="http://schemas.microsoft.com/office/word/2024/wordml/sdtformatlock" xmlns:w16se="http://schemas.microsoft.com/office/word/2015/wordml/symex" xmlns:wpg="http://schemas.microsoft.com/office/word/2010/wordprocessingGroup" xmlns:wpi="http://schemas.microsoft.com/office/word/2010/wordprocessingInk" xmlns:wne="http://schemas.microsoft.com/office/word/2006/wordml" xmlns:wps="http://schemas.microsoft.com/office/word/2010/wordprocessingShape" mc:Ignorable="w14 w15 w16se w16cid w16 w16cex w16sdtdh w16sdtfl w16du wp14">
   <w:abstractNum w:abstractNumId="0" w15:restartNumberingAfterBreak="0">
-    <w:nsid w:val="46265F19"/>
+    <w:nsid w:val="140E1B28"/>
     <w:multiLevelType w:val="multilevel"/>
     <w:tmpl w:val="00647B46"/>
     <w:lvl w:ilvl="0">
@@ -2113,7 +2276,123 @@
       </w:rPr>
     </w:lvl>
   </w:abstractNum>
+  <w:abstractNum w:abstractNumId="1" w15:restartNumberingAfterBreak="0">
+    <w:nsid w:val="46265F19"/>
+    <w:multiLevelType w:val="multilevel"/>
+    <w:tmpl w:val="00647B46"/>
+    <w:lvl w:ilvl="0">
+      <w:start w:val="1"/>
+      <w:numFmt w:val="decimal"/>
+      <w:lvlText w:val="%1."/>
+      <w:lvlJc w:val="left"/>
+      <w:pPr>
+        <w:ind w:left="720" w:hanging="360"/>
+      </w:pPr>
+      <w:rPr>
+        <w:u w:val="none"/>
+      </w:rPr>
+    </w:lvl>
+    <w:lvl w:ilvl="1">
+      <w:start w:val="1"/>
+      <w:numFmt w:val="lowerLetter"/>
+      <w:lvlText w:val="%2."/>
+      <w:lvlJc w:val="left"/>
+      <w:pPr>
+        <w:ind w:left="1440" w:hanging="360"/>
+      </w:pPr>
+      <w:rPr>
+        <w:u w:val="none"/>
+      </w:rPr>
+    </w:lvl>
+    <w:lvl w:ilvl="2">
+      <w:start w:val="1"/>
+      <w:numFmt w:val="lowerRoman"/>
+      <w:lvlText w:val="%3."/>
+      <w:lvlJc w:val="right"/>
+      <w:pPr>
+        <w:ind w:left="2160" w:hanging="360"/>
+      </w:pPr>
+      <w:rPr>
+        <w:u w:val="none"/>
+      </w:rPr>
+    </w:lvl>
+    <w:lvl w:ilvl="3">
+      <w:start w:val="1"/>
+      <w:numFmt w:val="decimal"/>
+      <w:lvlText w:val="%4."/>
+      <w:lvlJc w:val="left"/>
+      <w:pPr>
+        <w:ind w:left="2880" w:hanging="360"/>
+      </w:pPr>
+      <w:rPr>
+        <w:u w:val="none"/>
+      </w:rPr>
+    </w:lvl>
+    <w:lvl w:ilvl="4">
+      <w:start w:val="1"/>
+      <w:numFmt w:val="lowerLetter"/>
+      <w:lvlText w:val="%5."/>
+      <w:lvlJc w:val="left"/>
+      <w:pPr>
+        <w:ind w:left="3600" w:hanging="360"/>
+      </w:pPr>
+      <w:rPr>
+        <w:u w:val="none"/>
+      </w:rPr>
+    </w:lvl>
+    <w:lvl w:ilvl="5">
+      <w:start w:val="1"/>
+      <w:numFmt w:val="lowerRoman"/>
+      <w:lvlText w:val="%6."/>
+      <w:lvlJc w:val="right"/>
+      <w:pPr>
+        <w:ind w:left="4320" w:hanging="360"/>
+      </w:pPr>
+      <w:rPr>
+        <w:u w:val="none"/>
+      </w:rPr>
+    </w:lvl>
+    <w:lvl w:ilvl="6">
+      <w:start w:val="1"/>
+      <w:numFmt w:val="decimal"/>
+      <w:lvlText w:val="%7."/>
+      <w:lvlJc w:val="left"/>
+      <w:pPr>
+        <w:ind w:left="5040" w:hanging="360"/>
+      </w:pPr>
+      <w:rPr>
+        <w:u w:val="none"/>
+      </w:rPr>
+    </w:lvl>
+    <w:lvl w:ilvl="7">
+      <w:start w:val="1"/>
+      <w:numFmt w:val="lowerLetter"/>
+      <w:lvlText w:val="%8."/>
+      <w:lvlJc w:val="left"/>
+      <w:pPr>
+        <w:ind w:left="5760" w:hanging="360"/>
+      </w:pPr>
+      <w:rPr>
+        <w:u w:val="none"/>
+      </w:rPr>
+    </w:lvl>
+    <w:lvl w:ilvl="8">
+      <w:start w:val="1"/>
+      <w:numFmt w:val="lowerRoman"/>
+      <w:lvlText w:val="%9."/>
+      <w:lvlJc w:val="right"/>
+      <w:pPr>
+        <w:ind w:left="6480" w:hanging="360"/>
+      </w:pPr>
+      <w:rPr>
+        <w:u w:val="none"/>
+      </w:rPr>
+    </w:lvl>
+  </w:abstractNum>
   <w:num w:numId="1" w16cid:durableId="599996585">
+    <w:abstractNumId w:val="1"/>
+  </w:num>
+  <w:num w:numId="2" w16cid:durableId="381027615">
     <w:abstractNumId w:val="0"/>
   </w:num>
 </w:numbering>

</xml_diff>

<commit_message>
How does AWS S3, Lambda, S3 Trigger, and AWS Glue works together, explanation added
</commit_message>
<xml_diff>
--- a/New folder/Lambda-WithS3Trigger- Doc 2.docx
+++ b/New folder/Lambda-WithS3Trigger- Doc 2.docx
@@ -100,8 +100,19 @@
           <w:color w:val="16191F"/>
           <w:highlight w:val="white"/>
         </w:rPr>
-        <w:t>Add Lambda_adminRole</w:t>
-      </w:r>
+        <w:t xml:space="preserve">Add </w:t>
+      </w:r>
+      <w:proofErr w:type="spellStart"/>
+      <w:r>
+        <w:rPr>
+          <w:rFonts w:ascii="Roboto" w:eastAsia="Roboto" w:hAnsi="Roboto" w:cs="Roboto"/>
+          <w:b/>
+          <w:color w:val="16191F"/>
+          <w:highlight w:val="white"/>
+        </w:rPr>
+        <w:t>Lambda_adminRole</w:t>
+      </w:r>
+      <w:proofErr w:type="spellEnd"/>
     </w:p>
     <w:p>
       <w:pPr>
@@ -364,25 +375,37 @@
               <w:jc w:val="both"/>
             </w:pPr>
             <w:r>
-              <w:t>import json</w:t>
-            </w:r>
-          </w:p>
-          <w:p>
-            <w:pPr>
-              <w:widowControl w:val="0"/>
-              <w:pBdr>
-                <w:top w:val="nil"/>
-                <w:left w:val="nil"/>
-                <w:bottom w:val="nil"/>
-                <w:right w:val="nil"/>
-                <w:between w:val="nil"/>
-              </w:pBdr>
-              <w:spacing w:line="240" w:lineRule="auto"/>
-              <w:jc w:val="both"/>
-            </w:pPr>
-            <w:r>
-              <w:t>import urllib.parse</w:t>
-            </w:r>
+              <w:t xml:space="preserve">import </w:t>
+            </w:r>
+            <w:proofErr w:type="spellStart"/>
+            <w:r>
+              <w:t>json</w:t>
+            </w:r>
+            <w:proofErr w:type="spellEnd"/>
+          </w:p>
+          <w:p>
+            <w:pPr>
+              <w:widowControl w:val="0"/>
+              <w:pBdr>
+                <w:top w:val="nil"/>
+                <w:left w:val="nil"/>
+                <w:bottom w:val="nil"/>
+                <w:right w:val="nil"/>
+                <w:between w:val="nil"/>
+              </w:pBdr>
+              <w:spacing w:line="240" w:lineRule="auto"/>
+              <w:jc w:val="both"/>
+            </w:pPr>
+            <w:r>
+              <w:t xml:space="preserve">import </w:t>
+            </w:r>
+            <w:proofErr w:type="spellStart"/>
+            <w:proofErr w:type="gramStart"/>
+            <w:r>
+              <w:t>urllib.parse</w:t>
+            </w:r>
+            <w:proofErr w:type="spellEnd"/>
+            <w:proofErr w:type="gramEnd"/>
           </w:p>
           <w:p>
             <w:pPr>
@@ -428,8 +451,13 @@
               <w:spacing w:line="240" w:lineRule="auto"/>
               <w:jc w:val="both"/>
             </w:pPr>
-            <w:r>
-              <w:t>print('Loading function')</w:t>
+            <w:proofErr w:type="gramStart"/>
+            <w:r>
+              <w:t>print(</w:t>
+            </w:r>
+            <w:proofErr w:type="gramEnd"/>
+            <w:r>
+              <w:t>'Loading function')</w:t>
             </w:r>
           </w:p>
           <w:p>
@@ -505,24 +533,58 @@
               <w:jc w:val="both"/>
             </w:pPr>
             <w:r>
-              <w:t>def lambda_handler(event, context):</w:t>
-            </w:r>
-          </w:p>
-          <w:p>
-            <w:pPr>
-              <w:widowControl w:val="0"/>
-              <w:pBdr>
-                <w:top w:val="nil"/>
-                <w:left w:val="nil"/>
-                <w:bottom w:val="nil"/>
-                <w:right w:val="nil"/>
-                <w:between w:val="nil"/>
-              </w:pBdr>
-              <w:spacing w:line="240" w:lineRule="auto"/>
-              <w:jc w:val="both"/>
-            </w:pPr>
-            <w:r>
-              <w:t xml:space="preserve">    #print("Received event: " + json.dumps(event, indent=2))</w:t>
+              <w:t xml:space="preserve">def </w:t>
+            </w:r>
+            <w:proofErr w:type="spellStart"/>
+            <w:r>
+              <w:t>lambda_</w:t>
+            </w:r>
+            <w:proofErr w:type="gramStart"/>
+            <w:r>
+              <w:t>handler</w:t>
+            </w:r>
+            <w:proofErr w:type="spellEnd"/>
+            <w:r>
+              <w:t>(</w:t>
+            </w:r>
+            <w:proofErr w:type="gramEnd"/>
+            <w:r>
+              <w:t>event, context):</w:t>
+            </w:r>
+          </w:p>
+          <w:p>
+            <w:pPr>
+              <w:widowControl w:val="0"/>
+              <w:pBdr>
+                <w:top w:val="nil"/>
+                <w:left w:val="nil"/>
+                <w:bottom w:val="nil"/>
+                <w:right w:val="nil"/>
+                <w:between w:val="nil"/>
+              </w:pBdr>
+              <w:spacing w:line="240" w:lineRule="auto"/>
+              <w:jc w:val="both"/>
+            </w:pPr>
+            <w:r>
+              <w:t xml:space="preserve">    #</w:t>
+            </w:r>
+            <w:proofErr w:type="gramStart"/>
+            <w:r>
+              <w:t>print(</w:t>
+            </w:r>
+            <w:proofErr w:type="gramEnd"/>
+            <w:r>
+              <w:t xml:space="preserve">"Received event: " + </w:t>
+            </w:r>
+            <w:proofErr w:type="spellStart"/>
+            <w:proofErr w:type="gramStart"/>
+            <w:r>
+              <w:t>json.dumps</w:t>
+            </w:r>
+            <w:proofErr w:type="spellEnd"/>
+            <w:proofErr w:type="gramEnd"/>
+            <w:r>
+              <w:t>(event, indent=2))</w:t>
             </w:r>
           </w:p>
           <w:p>
@@ -570,24 +632,80 @@
               <w:jc w:val="both"/>
             </w:pPr>
             <w:r>
-              <w:t xml:space="preserve">    bucket = event['Records'][0]['s3']['bucket']['name']</w:t>
-            </w:r>
-          </w:p>
-          <w:p>
-            <w:pPr>
-              <w:widowControl w:val="0"/>
-              <w:pBdr>
-                <w:top w:val="nil"/>
-                <w:left w:val="nil"/>
-                <w:bottom w:val="nil"/>
-                <w:right w:val="nil"/>
-                <w:between w:val="nil"/>
-              </w:pBdr>
-              <w:spacing w:line="240" w:lineRule="auto"/>
-              <w:jc w:val="both"/>
-            </w:pPr>
-            <w:r>
-              <w:t xml:space="preserve">    key = urllib.parse.unquote_plus(event['Records'][0]['s3']['object']['key'], encoding='utf-8')</w:t>
+              <w:t xml:space="preserve">    bucket = event['Records'][</w:t>
+            </w:r>
+            <w:proofErr w:type="gramStart"/>
+            <w:r>
+              <w:t>0][</w:t>
+            </w:r>
+            <w:proofErr w:type="gramEnd"/>
+            <w:r>
+              <w:t>'s3</w:t>
+            </w:r>
+            <w:proofErr w:type="gramStart"/>
+            <w:r>
+              <w:t>'][</w:t>
+            </w:r>
+            <w:proofErr w:type="gramEnd"/>
+            <w:r>
+              <w:t>'bucket</w:t>
+            </w:r>
+            <w:proofErr w:type="gramStart"/>
+            <w:r>
+              <w:t>'][</w:t>
+            </w:r>
+            <w:proofErr w:type="gramEnd"/>
+            <w:r>
+              <w:t>'name']</w:t>
+            </w:r>
+          </w:p>
+          <w:p>
+            <w:pPr>
+              <w:widowControl w:val="0"/>
+              <w:pBdr>
+                <w:top w:val="nil"/>
+                <w:left w:val="nil"/>
+                <w:bottom w:val="nil"/>
+                <w:right w:val="nil"/>
+                <w:between w:val="nil"/>
+              </w:pBdr>
+              <w:spacing w:line="240" w:lineRule="auto"/>
+              <w:jc w:val="both"/>
+            </w:pPr>
+            <w:r>
+              <w:t xml:space="preserve">    key = </w:t>
+            </w:r>
+            <w:proofErr w:type="gramStart"/>
+            <w:r>
+              <w:t>urllib.parse</w:t>
+            </w:r>
+            <w:proofErr w:type="gramEnd"/>
+            <w:r>
+              <w:t>.unquote_plus(event['Records'][</w:t>
+            </w:r>
+            <w:proofErr w:type="gramStart"/>
+            <w:r>
+              <w:t>0][</w:t>
+            </w:r>
+            <w:proofErr w:type="gramEnd"/>
+            <w:r>
+              <w:t>'s3</w:t>
+            </w:r>
+            <w:proofErr w:type="gramStart"/>
+            <w:r>
+              <w:t>'][</w:t>
+            </w:r>
+            <w:proofErr w:type="gramEnd"/>
+            <w:r>
+              <w:t>'object</w:t>
+            </w:r>
+            <w:proofErr w:type="gramStart"/>
+            <w:r>
+              <w:t>'][</w:t>
+            </w:r>
+            <w:proofErr w:type="gramEnd"/>
+            <w:r>
+              <w:t>'key'], encoding='utf-8')</w:t>
             </w:r>
           </w:p>
           <w:p>
@@ -621,24 +739,15 @@
               <w:jc w:val="both"/>
             </w:pPr>
             <w:r>
-              <w:t xml:space="preserve">        response = s3.get_object(Bucket=bucket, Key=key)</w:t>
-            </w:r>
-          </w:p>
-          <w:p>
-            <w:pPr>
-              <w:widowControl w:val="0"/>
-              <w:pBdr>
-                <w:top w:val="nil"/>
-                <w:left w:val="nil"/>
-                <w:bottom w:val="nil"/>
-                <w:right w:val="nil"/>
-                <w:between w:val="nil"/>
-              </w:pBdr>
-              <w:spacing w:line="240" w:lineRule="auto"/>
-              <w:jc w:val="both"/>
-            </w:pPr>
-            <w:r>
-              <w:t xml:space="preserve">        print("CONTENT TYPE: " + response['ContentType'])</w:t>
+              <w:t xml:space="preserve">        response = s3.get_</w:t>
+            </w:r>
+            <w:proofErr w:type="gramStart"/>
+            <w:r>
+              <w:t>object(</w:t>
+            </w:r>
+            <w:proofErr w:type="gramEnd"/>
+            <w:r>
+              <w:t>Bucket=bucket, Key=key)</w:t>
             </w:r>
           </w:p>
           <w:p>
@@ -657,56 +766,113 @@
             <w:r>
               <w:t xml:space="preserve">        </w:t>
             </w:r>
-          </w:p>
-          <w:p>
-            <w:pPr>
-              <w:widowControl w:val="0"/>
-              <w:pBdr>
-                <w:top w:val="nil"/>
-                <w:left w:val="nil"/>
-                <w:bottom w:val="nil"/>
-                <w:right w:val="nil"/>
-                <w:between w:val="nil"/>
-              </w:pBdr>
-              <w:spacing w:line="240" w:lineRule="auto"/>
-              <w:jc w:val="both"/>
-            </w:pPr>
-            <w:r>
-              <w:t xml:space="preserve">        print("File Name: " + key)</w:t>
-            </w:r>
-          </w:p>
-          <w:p>
-            <w:pPr>
-              <w:widowControl w:val="0"/>
-              <w:pBdr>
-                <w:top w:val="nil"/>
-                <w:left w:val="nil"/>
-                <w:bottom w:val="nil"/>
-                <w:right w:val="nil"/>
-                <w:between w:val="nil"/>
-              </w:pBdr>
-              <w:spacing w:line="240" w:lineRule="auto"/>
-              <w:jc w:val="both"/>
-            </w:pPr>
-            <w:r>
-              <w:t xml:space="preserve">        print("bucket Name: " + bucket)</w:t>
-            </w:r>
-          </w:p>
-          <w:p>
-            <w:pPr>
-              <w:widowControl w:val="0"/>
-              <w:pBdr>
-                <w:top w:val="nil"/>
-                <w:left w:val="nil"/>
-                <w:bottom w:val="nil"/>
-                <w:right w:val="nil"/>
-                <w:between w:val="nil"/>
-              </w:pBdr>
-              <w:spacing w:line="240" w:lineRule="auto"/>
-              <w:jc w:val="both"/>
-            </w:pPr>
-            <w:r>
-              <w:t xml:space="preserve">        return response['ContentType']</w:t>
+            <w:proofErr w:type="gramStart"/>
+            <w:r>
+              <w:t>print(</w:t>
+            </w:r>
+            <w:proofErr w:type="gramEnd"/>
+            <w:r>
+              <w:t>"CONTENT TYPE: " + response['</w:t>
+            </w:r>
+            <w:proofErr w:type="spellStart"/>
+            <w:r>
+              <w:t>ContentType</w:t>
+            </w:r>
+            <w:proofErr w:type="spellEnd"/>
+            <w:r>
+              <w:t>'])</w:t>
+            </w:r>
+          </w:p>
+          <w:p>
+            <w:pPr>
+              <w:widowControl w:val="0"/>
+              <w:pBdr>
+                <w:top w:val="nil"/>
+                <w:left w:val="nil"/>
+                <w:bottom w:val="nil"/>
+                <w:right w:val="nil"/>
+                <w:between w:val="nil"/>
+              </w:pBdr>
+              <w:spacing w:line="240" w:lineRule="auto"/>
+              <w:jc w:val="both"/>
+            </w:pPr>
+            <w:r>
+              <w:t xml:space="preserve">        </w:t>
+            </w:r>
+          </w:p>
+          <w:p>
+            <w:pPr>
+              <w:widowControl w:val="0"/>
+              <w:pBdr>
+                <w:top w:val="nil"/>
+                <w:left w:val="nil"/>
+                <w:bottom w:val="nil"/>
+                <w:right w:val="nil"/>
+                <w:between w:val="nil"/>
+              </w:pBdr>
+              <w:spacing w:line="240" w:lineRule="auto"/>
+              <w:jc w:val="both"/>
+            </w:pPr>
+            <w:r>
+              <w:t xml:space="preserve">        </w:t>
+            </w:r>
+            <w:proofErr w:type="gramStart"/>
+            <w:r>
+              <w:t>print(</w:t>
+            </w:r>
+            <w:proofErr w:type="gramEnd"/>
+            <w:r>
+              <w:t>"File Name: " + key)</w:t>
+            </w:r>
+          </w:p>
+          <w:p>
+            <w:pPr>
+              <w:widowControl w:val="0"/>
+              <w:pBdr>
+                <w:top w:val="nil"/>
+                <w:left w:val="nil"/>
+                <w:bottom w:val="nil"/>
+                <w:right w:val="nil"/>
+                <w:between w:val="nil"/>
+              </w:pBdr>
+              <w:spacing w:line="240" w:lineRule="auto"/>
+              <w:jc w:val="both"/>
+            </w:pPr>
+            <w:r>
+              <w:t xml:space="preserve">        </w:t>
+            </w:r>
+            <w:proofErr w:type="gramStart"/>
+            <w:r>
+              <w:t>print(</w:t>
+            </w:r>
+            <w:proofErr w:type="gramEnd"/>
+            <w:r>
+              <w:t>"bucket Name: " + bucket)</w:t>
+            </w:r>
+          </w:p>
+          <w:p>
+            <w:pPr>
+              <w:widowControl w:val="0"/>
+              <w:pBdr>
+                <w:top w:val="nil"/>
+                <w:left w:val="nil"/>
+                <w:bottom w:val="nil"/>
+                <w:right w:val="nil"/>
+                <w:between w:val="nil"/>
+              </w:pBdr>
+              <w:spacing w:line="240" w:lineRule="auto"/>
+              <w:jc w:val="both"/>
+            </w:pPr>
+            <w:r>
+              <w:t xml:space="preserve">        return response['</w:t>
+            </w:r>
+            <w:proofErr w:type="spellStart"/>
+            <w:r>
+              <w:t>ContentType</w:t>
+            </w:r>
+            <w:proofErr w:type="spellEnd"/>
+            <w:r>
+              <w:t>']</w:t>
             </w:r>
           </w:p>
           <w:p>
@@ -757,7 +923,28 @@
               <w:jc w:val="both"/>
             </w:pPr>
             <w:r>
-              <w:t xml:space="preserve">        print('Error getting object {} from bucket {}. Make sure they exist and your bucket is in the same region as this function.'.format(key, bucket))</w:t>
+              <w:t xml:space="preserve">        </w:t>
+            </w:r>
+            <w:proofErr w:type="gramStart"/>
+            <w:r>
+              <w:t>print(</w:t>
+            </w:r>
+            <w:proofErr w:type="gramEnd"/>
+            <w:r>
+              <w:t xml:space="preserve">'Error getting object {} from bucket {}. Make sure they exist and your bucket is in the same region as this </w:t>
+            </w:r>
+            <w:proofErr w:type="spellStart"/>
+            <w:r>
+              <w:t>function.</w:t>
+            </w:r>
+            <w:proofErr w:type="gramStart"/>
+            <w:r>
+              <w:t>'.format</w:t>
+            </w:r>
+            <w:proofErr w:type="spellEnd"/>
+            <w:proofErr w:type="gramEnd"/>
+            <w:r>
+              <w:t>(key, bucket))</w:t>
             </w:r>
           </w:p>
           <w:p>
@@ -984,75 +1171,128 @@
               <w:jc w:val="both"/>
             </w:pPr>
             <w:r>
-              <w:t xml:space="preserve">      "eventVersion": "2.0",</w:t>
-            </w:r>
-          </w:p>
-          <w:p>
-            <w:pPr>
-              <w:widowControl w:val="0"/>
-              <w:pBdr>
-                <w:top w:val="nil"/>
-                <w:left w:val="nil"/>
-                <w:bottom w:val="nil"/>
-                <w:right w:val="nil"/>
-                <w:between w:val="nil"/>
-              </w:pBdr>
-              <w:spacing w:line="240" w:lineRule="auto"/>
-              <w:jc w:val="both"/>
-            </w:pPr>
-            <w:r>
-              <w:t xml:space="preserve">      "eventSource": "aws:s3",</w:t>
-            </w:r>
-          </w:p>
-          <w:p>
-            <w:pPr>
-              <w:widowControl w:val="0"/>
-              <w:pBdr>
-                <w:top w:val="nil"/>
-                <w:left w:val="nil"/>
-                <w:bottom w:val="nil"/>
-                <w:right w:val="nil"/>
-                <w:between w:val="nil"/>
-              </w:pBdr>
-              <w:spacing w:line="240" w:lineRule="auto"/>
-              <w:jc w:val="both"/>
-            </w:pPr>
-            <w:r>
-              <w:t xml:space="preserve">      "awsRegion": "us-east-1",</w:t>
-            </w:r>
-          </w:p>
-          <w:p>
-            <w:pPr>
-              <w:widowControl w:val="0"/>
-              <w:pBdr>
-                <w:top w:val="nil"/>
-                <w:left w:val="nil"/>
-                <w:bottom w:val="nil"/>
-                <w:right w:val="nil"/>
-                <w:between w:val="nil"/>
-              </w:pBdr>
-              <w:spacing w:line="240" w:lineRule="auto"/>
-              <w:jc w:val="both"/>
-            </w:pPr>
-            <w:r>
-              <w:t xml:space="preserve">      "eventTime": "1970-01-01T00:00:00.000Z",</w:t>
-            </w:r>
-          </w:p>
-          <w:p>
-            <w:pPr>
-              <w:widowControl w:val="0"/>
-              <w:pBdr>
-                <w:top w:val="nil"/>
-                <w:left w:val="nil"/>
-                <w:bottom w:val="nil"/>
-                <w:right w:val="nil"/>
-                <w:between w:val="nil"/>
-              </w:pBdr>
-              <w:spacing w:line="240" w:lineRule="auto"/>
-              <w:jc w:val="both"/>
-            </w:pPr>
-            <w:r>
-              <w:t xml:space="preserve">      "eventName": "ObjectCreated:</w:t>
+              <w:t xml:space="preserve">      "</w:t>
+            </w:r>
+            <w:proofErr w:type="spellStart"/>
+            <w:r>
+              <w:t>eventVersion</w:t>
+            </w:r>
+            <w:proofErr w:type="spellEnd"/>
+            <w:r>
+              <w:t>": "2.0",</w:t>
+            </w:r>
+          </w:p>
+          <w:p>
+            <w:pPr>
+              <w:widowControl w:val="0"/>
+              <w:pBdr>
+                <w:top w:val="nil"/>
+                <w:left w:val="nil"/>
+                <w:bottom w:val="nil"/>
+                <w:right w:val="nil"/>
+                <w:between w:val="nil"/>
+              </w:pBdr>
+              <w:spacing w:line="240" w:lineRule="auto"/>
+              <w:jc w:val="both"/>
+            </w:pPr>
+            <w:r>
+              <w:t xml:space="preserve">      "</w:t>
+            </w:r>
+            <w:proofErr w:type="spellStart"/>
+            <w:r>
+              <w:t>eventSource</w:t>
+            </w:r>
+            <w:proofErr w:type="spellEnd"/>
+            <w:r>
+              <w:t>": "</w:t>
+            </w:r>
+            <w:proofErr w:type="gramStart"/>
+            <w:r>
+              <w:t>aws:s</w:t>
+            </w:r>
+            <w:proofErr w:type="gramEnd"/>
+            <w:r>
+              <w:t>3",</w:t>
+            </w:r>
+          </w:p>
+          <w:p>
+            <w:pPr>
+              <w:widowControl w:val="0"/>
+              <w:pBdr>
+                <w:top w:val="nil"/>
+                <w:left w:val="nil"/>
+                <w:bottom w:val="nil"/>
+                <w:right w:val="nil"/>
+                <w:between w:val="nil"/>
+              </w:pBdr>
+              <w:spacing w:line="240" w:lineRule="auto"/>
+              <w:jc w:val="both"/>
+            </w:pPr>
+            <w:r>
+              <w:t xml:space="preserve">      "</w:t>
+            </w:r>
+            <w:proofErr w:type="spellStart"/>
+            <w:r>
+              <w:t>awsRegion</w:t>
+            </w:r>
+            <w:proofErr w:type="spellEnd"/>
+            <w:r>
+              <w:t>": "us-east-1",</w:t>
+            </w:r>
+          </w:p>
+          <w:p>
+            <w:pPr>
+              <w:widowControl w:val="0"/>
+              <w:pBdr>
+                <w:top w:val="nil"/>
+                <w:left w:val="nil"/>
+                <w:bottom w:val="nil"/>
+                <w:right w:val="nil"/>
+                <w:between w:val="nil"/>
+              </w:pBdr>
+              <w:spacing w:line="240" w:lineRule="auto"/>
+              <w:jc w:val="both"/>
+            </w:pPr>
+            <w:r>
+              <w:t xml:space="preserve">      "</w:t>
+            </w:r>
+            <w:proofErr w:type="spellStart"/>
+            <w:r>
+              <w:t>eventTime</w:t>
+            </w:r>
+            <w:proofErr w:type="spellEnd"/>
+            <w:r>
+              <w:t>": "1970-01-01T00:00:00.000Z",</w:t>
+            </w:r>
+          </w:p>
+          <w:p>
+            <w:pPr>
+              <w:widowControl w:val="0"/>
+              <w:pBdr>
+                <w:top w:val="nil"/>
+                <w:left w:val="nil"/>
+                <w:bottom w:val="nil"/>
+                <w:right w:val="nil"/>
+                <w:between w:val="nil"/>
+              </w:pBdr>
+              <w:spacing w:line="240" w:lineRule="auto"/>
+              <w:jc w:val="both"/>
+            </w:pPr>
+            <w:r>
+              <w:t xml:space="preserve">      "</w:t>
+            </w:r>
+            <w:proofErr w:type="spellStart"/>
+            <w:r>
+              <w:t>eventName</w:t>
+            </w:r>
+            <w:proofErr w:type="spellEnd"/>
+            <w:r>
+              <w:t>": "</w:t>
+            </w:r>
+            <w:proofErr w:type="spellStart"/>
+            <w:proofErr w:type="gramStart"/>
+            <w:r>
+              <w:t>ObjectCreated:</w:t>
             </w:r>
             <w:r>
               <w:rPr>
@@ -1060,6 +1300,8 @@
               </w:rPr>
               <w:t>Put</w:t>
             </w:r>
+            <w:proofErr w:type="spellEnd"/>
+            <w:proofErr w:type="gramEnd"/>
             <w:r>
               <w:t>",</w:t>
             </w:r>
@@ -1078,24 +1320,40 @@
               <w:jc w:val="both"/>
             </w:pPr>
             <w:r>
-              <w:t xml:space="preserve">      "userIdentity": {</w:t>
-            </w:r>
-          </w:p>
-          <w:p>
-            <w:pPr>
-              <w:widowControl w:val="0"/>
-              <w:pBdr>
-                <w:top w:val="nil"/>
-                <w:left w:val="nil"/>
-                <w:bottom w:val="nil"/>
-                <w:right w:val="nil"/>
-                <w:between w:val="nil"/>
-              </w:pBdr>
-              <w:spacing w:line="240" w:lineRule="auto"/>
-              <w:jc w:val="both"/>
-            </w:pPr>
-            <w:r>
-              <w:t xml:space="preserve">        "principalId": "EXAMPLE"</w:t>
+              <w:t xml:space="preserve">      "</w:t>
+            </w:r>
+            <w:proofErr w:type="spellStart"/>
+            <w:r>
+              <w:t>userIdentity</w:t>
+            </w:r>
+            <w:proofErr w:type="spellEnd"/>
+            <w:r>
+              <w:t>": {</w:t>
+            </w:r>
+          </w:p>
+          <w:p>
+            <w:pPr>
+              <w:widowControl w:val="0"/>
+              <w:pBdr>
+                <w:top w:val="nil"/>
+                <w:left w:val="nil"/>
+                <w:bottom w:val="nil"/>
+                <w:right w:val="nil"/>
+                <w:between w:val="nil"/>
+              </w:pBdr>
+              <w:spacing w:line="240" w:lineRule="auto"/>
+              <w:jc w:val="both"/>
+            </w:pPr>
+            <w:r>
+              <w:t xml:space="preserve">        "</w:t>
+            </w:r>
+            <w:proofErr w:type="spellStart"/>
+            <w:r>
+              <w:t>principalId</w:t>
+            </w:r>
+            <w:proofErr w:type="spellEnd"/>
+            <w:r>
+              <w:t>": "EXAMPLE"</w:t>
             </w:r>
           </w:p>
           <w:p>
@@ -1129,24 +1387,40 @@
               <w:jc w:val="both"/>
             </w:pPr>
             <w:r>
-              <w:t xml:space="preserve">      "requestParameters": {</w:t>
-            </w:r>
-          </w:p>
-          <w:p>
-            <w:pPr>
-              <w:widowControl w:val="0"/>
-              <w:pBdr>
-                <w:top w:val="nil"/>
-                <w:left w:val="nil"/>
-                <w:bottom w:val="nil"/>
-                <w:right w:val="nil"/>
-                <w:between w:val="nil"/>
-              </w:pBdr>
-              <w:spacing w:line="240" w:lineRule="auto"/>
-              <w:jc w:val="both"/>
-            </w:pPr>
-            <w:r>
-              <w:t xml:space="preserve">        "sourceIPAddress": "127.0.0.1"</w:t>
+              <w:t xml:space="preserve">      "</w:t>
+            </w:r>
+            <w:proofErr w:type="spellStart"/>
+            <w:r>
+              <w:t>requestParameters</w:t>
+            </w:r>
+            <w:proofErr w:type="spellEnd"/>
+            <w:r>
+              <w:t>": {</w:t>
+            </w:r>
+          </w:p>
+          <w:p>
+            <w:pPr>
+              <w:widowControl w:val="0"/>
+              <w:pBdr>
+                <w:top w:val="nil"/>
+                <w:left w:val="nil"/>
+                <w:bottom w:val="nil"/>
+                <w:right w:val="nil"/>
+                <w:between w:val="nil"/>
+              </w:pBdr>
+              <w:spacing w:line="240" w:lineRule="auto"/>
+              <w:jc w:val="both"/>
+            </w:pPr>
+            <w:r>
+              <w:t xml:space="preserve">        "</w:t>
+            </w:r>
+            <w:proofErr w:type="spellStart"/>
+            <w:r>
+              <w:t>sourceIPAddress</w:t>
+            </w:r>
+            <w:proofErr w:type="spellEnd"/>
+            <w:r>
+              <w:t>": "127.0.0.1"</w:t>
             </w:r>
           </w:p>
           <w:p>
@@ -1180,24 +1454,40 @@
               <w:jc w:val="both"/>
             </w:pPr>
             <w:r>
-              <w:t xml:space="preserve">      "responseElements": {</w:t>
-            </w:r>
-          </w:p>
-          <w:p>
-            <w:pPr>
-              <w:widowControl w:val="0"/>
-              <w:pBdr>
-                <w:top w:val="nil"/>
-                <w:left w:val="nil"/>
-                <w:bottom w:val="nil"/>
-                <w:right w:val="nil"/>
-                <w:between w:val="nil"/>
-              </w:pBdr>
-              <w:spacing w:line="240" w:lineRule="auto"/>
-              <w:jc w:val="both"/>
-            </w:pPr>
-            <w:r>
-              <w:t xml:space="preserve">        "x-amz-request-id": "EXAMPLE123456789",</w:t>
+              <w:t xml:space="preserve">      "</w:t>
+            </w:r>
+            <w:proofErr w:type="spellStart"/>
+            <w:r>
+              <w:t>responseElements</w:t>
+            </w:r>
+            <w:proofErr w:type="spellEnd"/>
+            <w:r>
+              <w:t>": {</w:t>
+            </w:r>
+          </w:p>
+          <w:p>
+            <w:pPr>
+              <w:widowControl w:val="0"/>
+              <w:pBdr>
+                <w:top w:val="nil"/>
+                <w:left w:val="nil"/>
+                <w:bottom w:val="nil"/>
+                <w:right w:val="nil"/>
+                <w:between w:val="nil"/>
+              </w:pBdr>
+              <w:spacing w:line="240" w:lineRule="auto"/>
+              <w:jc w:val="both"/>
+            </w:pPr>
+            <w:r>
+              <w:t xml:space="preserve">        "x-</w:t>
+            </w:r>
+            <w:proofErr w:type="spellStart"/>
+            <w:r>
+              <w:t>amz</w:t>
+            </w:r>
+            <w:proofErr w:type="spellEnd"/>
+            <w:r>
+              <w:t>-request-id": "EXAMPLE123456789",</w:t>
             </w:r>
           </w:p>
           <w:p>
@@ -1282,7 +1572,23 @@
               <w:jc w:val="both"/>
             </w:pPr>
             <w:r>
-              <w:t xml:space="preserve">        "configurationId": "testConfigRule",</w:t>
+              <w:t xml:space="preserve">        "</w:t>
+            </w:r>
+            <w:proofErr w:type="spellStart"/>
+            <w:r>
+              <w:t>configurationId</w:t>
+            </w:r>
+            <w:proofErr w:type="spellEnd"/>
+            <w:r>
+              <w:t>": "</w:t>
+            </w:r>
+            <w:proofErr w:type="spellStart"/>
+            <w:r>
+              <w:t>testConfigRule</w:t>
+            </w:r>
+            <w:proofErr w:type="spellEnd"/>
+            <w:r>
+              <w:t>",</w:t>
             </w:r>
           </w:p>
           <w:p>
@@ -1342,24 +1648,40 @@
               <w:jc w:val="both"/>
             </w:pPr>
             <w:r>
-              <w:t xml:space="preserve">          "ownerIdentity": {</w:t>
-            </w:r>
-          </w:p>
-          <w:p>
-            <w:pPr>
-              <w:widowControl w:val="0"/>
-              <w:pBdr>
-                <w:top w:val="nil"/>
-                <w:left w:val="nil"/>
-                <w:bottom w:val="nil"/>
-                <w:right w:val="nil"/>
-                <w:between w:val="nil"/>
-              </w:pBdr>
-              <w:spacing w:line="240" w:lineRule="auto"/>
-              <w:jc w:val="both"/>
-            </w:pPr>
-            <w:r>
-              <w:t xml:space="preserve">            "principalId": "EXAMPLE"</w:t>
+              <w:t xml:space="preserve">          "</w:t>
+            </w:r>
+            <w:proofErr w:type="spellStart"/>
+            <w:r>
+              <w:t>ownerIdentity</w:t>
+            </w:r>
+            <w:proofErr w:type="spellEnd"/>
+            <w:r>
+              <w:t>": {</w:t>
+            </w:r>
+          </w:p>
+          <w:p>
+            <w:pPr>
+              <w:widowControl w:val="0"/>
+              <w:pBdr>
+                <w:top w:val="nil"/>
+                <w:left w:val="nil"/>
+                <w:bottom w:val="nil"/>
+                <w:right w:val="nil"/>
+                <w:between w:val="nil"/>
+              </w:pBdr>
+              <w:spacing w:line="240" w:lineRule="auto"/>
+              <w:jc w:val="both"/>
+            </w:pPr>
+            <w:r>
+              <w:t xml:space="preserve">            "</w:t>
+            </w:r>
+            <w:proofErr w:type="spellStart"/>
+            <w:r>
+              <w:t>principalId</w:t>
+            </w:r>
+            <w:proofErr w:type="spellEnd"/>
+            <w:r>
+              <w:t>": "EXAMPLE"</w:t>
             </w:r>
           </w:p>
           <w:p>
@@ -1393,8 +1715,29 @@
               <w:jc w:val="both"/>
             </w:pPr>
             <w:r>
-              <w:t xml:space="preserve">          "arn": "arn:aws:s3:::</w:t>
-            </w:r>
+              <w:t xml:space="preserve">          "</w:t>
+            </w:r>
+            <w:proofErr w:type="spellStart"/>
+            <w:r>
+              <w:t>arn</w:t>
+            </w:r>
+            <w:proofErr w:type="spellEnd"/>
+            <w:r>
+              <w:t>": "</w:t>
+            </w:r>
+            <w:proofErr w:type="gramStart"/>
+            <w:r>
+              <w:t>arn:aws</w:t>
+            </w:r>
+            <w:proofErr w:type="gramEnd"/>
+            <w:r>
+              <w:t>:s</w:t>
+            </w:r>
+            <w:proofErr w:type="gramStart"/>
+            <w:r>
+              <w:t>3:::</w:t>
+            </w:r>
+            <w:proofErr w:type="gramEnd"/>
             <w:r>
               <w:rPr>
                 <w:b/>
@@ -1693,11 +2036,19 @@
       <w:r>
         <w:t xml:space="preserve">And replace </w:t>
       </w:r>
+      <w:proofErr w:type="spellStart"/>
       <w:r>
         <w:rPr>
           <w:b/>
         </w:rPr>
-        <w:t xml:space="preserve">csv_non_parts_toORC </w:t>
+        <w:t>csv_non_parts_toORC</w:t>
+      </w:r>
+      <w:proofErr w:type="spellEnd"/>
+      <w:r>
+        <w:rPr>
+          <w:b/>
+        </w:rPr>
+        <w:t xml:space="preserve"> </w:t>
       </w:r>
       <w:r>
         <w:t>with your glue job.</w:t>
@@ -1749,24 +2100,34 @@
               <w:spacing w:line="240" w:lineRule="auto"/>
             </w:pPr>
             <w:r>
-              <w:t>import json</w:t>
-            </w:r>
-          </w:p>
-          <w:p>
-            <w:pPr>
-              <w:widowControl w:val="0"/>
-              <w:pBdr>
-                <w:top w:val="nil"/>
-                <w:left w:val="nil"/>
-                <w:bottom w:val="nil"/>
-                <w:right w:val="nil"/>
-                <w:between w:val="nil"/>
-              </w:pBdr>
-              <w:spacing w:line="240" w:lineRule="auto"/>
-            </w:pPr>
-            <w:r>
-              <w:t>import os</w:t>
-            </w:r>
+              <w:t xml:space="preserve">import </w:t>
+            </w:r>
+            <w:proofErr w:type="spellStart"/>
+            <w:r>
+              <w:t>json</w:t>
+            </w:r>
+            <w:proofErr w:type="spellEnd"/>
+          </w:p>
+          <w:p>
+            <w:pPr>
+              <w:widowControl w:val="0"/>
+              <w:pBdr>
+                <w:top w:val="nil"/>
+                <w:left w:val="nil"/>
+                <w:bottom w:val="nil"/>
+                <w:right w:val="nil"/>
+                <w:between w:val="nil"/>
+              </w:pBdr>
+              <w:spacing w:line="240" w:lineRule="auto"/>
+            </w:pPr>
+            <w:r>
+              <w:t xml:space="preserve">import </w:t>
+            </w:r>
+            <w:proofErr w:type="spellStart"/>
+            <w:r>
+              <w:t>os</w:t>
+            </w:r>
+            <w:proofErr w:type="spellEnd"/>
           </w:p>
           <w:p>
             <w:pPr>
@@ -1797,23 +2158,40 @@
               <w:spacing w:line="240" w:lineRule="auto"/>
             </w:pPr>
             <w:r>
-              <w:t>logger = logging.getLogger()</w:t>
-            </w:r>
-          </w:p>
-          <w:p>
-            <w:pPr>
-              <w:widowControl w:val="0"/>
-              <w:pBdr>
-                <w:top w:val="nil"/>
-                <w:left w:val="nil"/>
-                <w:bottom w:val="nil"/>
-                <w:right w:val="nil"/>
-                <w:between w:val="nil"/>
-              </w:pBdr>
-              <w:spacing w:line="240" w:lineRule="auto"/>
-            </w:pPr>
-            <w:r>
-              <w:t>logger.setLevel(logging.INFO)</w:t>
+              <w:t xml:space="preserve">logger = </w:t>
+            </w:r>
+            <w:proofErr w:type="spellStart"/>
+            <w:proofErr w:type="gramStart"/>
+            <w:r>
+              <w:t>logging.getLogger</w:t>
+            </w:r>
+            <w:proofErr w:type="spellEnd"/>
+            <w:proofErr w:type="gramEnd"/>
+            <w:r>
+              <w:t>()</w:t>
+            </w:r>
+          </w:p>
+          <w:p>
+            <w:pPr>
+              <w:widowControl w:val="0"/>
+              <w:pBdr>
+                <w:top w:val="nil"/>
+                <w:left w:val="nil"/>
+                <w:bottom w:val="nil"/>
+                <w:right w:val="nil"/>
+                <w:between w:val="nil"/>
+              </w:pBdr>
+              <w:spacing w:line="240" w:lineRule="auto"/>
+            </w:pPr>
+            <w:proofErr w:type="spellStart"/>
+            <w:proofErr w:type="gramStart"/>
+            <w:r>
+              <w:t>logger.setLevel</w:t>
+            </w:r>
+            <w:proofErr w:type="spellEnd"/>
+            <w:proofErr w:type="gramEnd"/>
+            <w:r>
+              <w:t>(logging.INFO)</w:t>
             </w:r>
           </w:p>
           <w:p>
@@ -1921,14 +2299,33 @@
                 <w:b/>
               </w:rPr>
             </w:pPr>
-            <w:r>
-              <w:t xml:space="preserve">glueJobName = </w:t>
+            <w:proofErr w:type="spellStart"/>
+            <w:r>
+              <w:t>glueJobName</w:t>
+            </w:r>
+            <w:proofErr w:type="spellEnd"/>
+            <w:r>
+              <w:t xml:space="preserve"> = </w:t>
             </w:r>
             <w:r>
               <w:rPr>
                 <w:b/>
               </w:rPr>
-              <w:t>"csv_non_parts_toORC"</w:t>
+              <w:t>"</w:t>
+            </w:r>
+            <w:proofErr w:type="spellStart"/>
+            <w:r>
+              <w:rPr>
+                <w:b/>
+              </w:rPr>
+              <w:t>csv_non_parts_toORC</w:t>
+            </w:r>
+            <w:proofErr w:type="spellEnd"/>
+            <w:r>
+              <w:rPr>
+                <w:b/>
+              </w:rPr>
+              <w:t>"</w:t>
             </w:r>
           </w:p>
           <w:p>
@@ -1973,23 +2370,47 @@
               <w:spacing w:line="240" w:lineRule="auto"/>
             </w:pPr>
             <w:r>
-              <w:t>def lambda_handler(event, context):</w:t>
-            </w:r>
-          </w:p>
-          <w:p>
-            <w:pPr>
-              <w:widowControl w:val="0"/>
-              <w:pBdr>
-                <w:top w:val="nil"/>
-                <w:left w:val="nil"/>
-                <w:bottom w:val="nil"/>
-                <w:right w:val="nil"/>
-                <w:between w:val="nil"/>
-              </w:pBdr>
-              <w:spacing w:line="240" w:lineRule="auto"/>
-            </w:pPr>
-            <w:r>
-              <w:t xml:space="preserve">    logger.info('## INITIATED BY EVENT: ')</w:t>
+              <w:t xml:space="preserve">def </w:t>
+            </w:r>
+            <w:proofErr w:type="spellStart"/>
+            <w:r>
+              <w:t>lambda_</w:t>
+            </w:r>
+            <w:proofErr w:type="gramStart"/>
+            <w:r>
+              <w:t>handler</w:t>
+            </w:r>
+            <w:proofErr w:type="spellEnd"/>
+            <w:r>
+              <w:t>(</w:t>
+            </w:r>
+            <w:proofErr w:type="gramEnd"/>
+            <w:r>
+              <w:t>event, context):</w:t>
+            </w:r>
+          </w:p>
+          <w:p>
+            <w:pPr>
+              <w:widowControl w:val="0"/>
+              <w:pBdr>
+                <w:top w:val="nil"/>
+                <w:left w:val="nil"/>
+                <w:bottom w:val="nil"/>
+                <w:right w:val="nil"/>
+                <w:between w:val="nil"/>
+              </w:pBdr>
+              <w:spacing w:line="240" w:lineRule="auto"/>
+            </w:pPr>
+            <w:r>
+              <w:t xml:space="preserve">    </w:t>
+            </w:r>
+            <w:proofErr w:type="gramStart"/>
+            <w:r>
+              <w:t>logger.info(</w:t>
+            </w:r>
+            <w:proofErr w:type="gramEnd"/>
+            <w:r>
+              <w:t>'## INITIATED BY EVENT: ')</w:t>
             </w:r>
           </w:p>
           <w:p>
@@ -2021,7 +2442,41 @@
               <w:spacing w:line="240" w:lineRule="auto"/>
             </w:pPr>
             <w:r>
-              <w:t xml:space="preserve">    response = client.start_job_run(JobName = glueJobName)</w:t>
+              <w:t xml:space="preserve">    response = </w:t>
+            </w:r>
+            <w:proofErr w:type="spellStart"/>
+            <w:proofErr w:type="gramStart"/>
+            <w:r>
+              <w:t>client.start</w:t>
+            </w:r>
+            <w:proofErr w:type="gramEnd"/>
+            <w:r>
+              <w:t>_job_</w:t>
+            </w:r>
+            <w:proofErr w:type="gramStart"/>
+            <w:r>
+              <w:t>run</w:t>
+            </w:r>
+            <w:proofErr w:type="spellEnd"/>
+            <w:r>
+              <w:t>(</w:t>
+            </w:r>
+            <w:proofErr w:type="spellStart"/>
+            <w:proofErr w:type="gramEnd"/>
+            <w:r>
+              <w:t>JobName</w:t>
+            </w:r>
+            <w:proofErr w:type="spellEnd"/>
+            <w:r>
+              <w:t xml:space="preserve"> = </w:t>
+            </w:r>
+            <w:proofErr w:type="spellStart"/>
+            <w:r>
+              <w:t>glueJobName</w:t>
+            </w:r>
+            <w:proofErr w:type="spellEnd"/>
+            <w:r>
+              <w:t>)</w:t>
             </w:r>
           </w:p>
           <w:p>
@@ -2053,23 +2508,55 @@
               <w:spacing w:line="240" w:lineRule="auto"/>
             </w:pPr>
             <w:r>
-              <w:t xml:space="preserve">    logger.info('## STARTED GLUE JOB: ' + glueJobName)</w:t>
-            </w:r>
-          </w:p>
-          <w:p>
-            <w:pPr>
-              <w:widowControl w:val="0"/>
-              <w:pBdr>
-                <w:top w:val="nil"/>
-                <w:left w:val="nil"/>
-                <w:bottom w:val="nil"/>
-                <w:right w:val="nil"/>
-                <w:between w:val="nil"/>
-              </w:pBdr>
-              <w:spacing w:line="240" w:lineRule="auto"/>
-            </w:pPr>
-            <w:r>
-              <w:t xml:space="preserve">    logger.info('## GLUE JOB RUN ID: ' + response['JobRunId'])</w:t>
+              <w:t xml:space="preserve">    </w:t>
+            </w:r>
+            <w:proofErr w:type="gramStart"/>
+            <w:r>
+              <w:t>logger.info(</w:t>
+            </w:r>
+            <w:proofErr w:type="gramEnd"/>
+            <w:r>
+              <w:t xml:space="preserve">'## STARTED GLUE JOB: ' + </w:t>
+            </w:r>
+            <w:proofErr w:type="spellStart"/>
+            <w:r>
+              <w:t>glueJobName</w:t>
+            </w:r>
+            <w:proofErr w:type="spellEnd"/>
+            <w:r>
+              <w:t>)</w:t>
+            </w:r>
+          </w:p>
+          <w:p>
+            <w:pPr>
+              <w:widowControl w:val="0"/>
+              <w:pBdr>
+                <w:top w:val="nil"/>
+                <w:left w:val="nil"/>
+                <w:bottom w:val="nil"/>
+                <w:right w:val="nil"/>
+                <w:between w:val="nil"/>
+              </w:pBdr>
+              <w:spacing w:line="240" w:lineRule="auto"/>
+            </w:pPr>
+            <w:r>
+              <w:t xml:space="preserve">    </w:t>
+            </w:r>
+            <w:proofErr w:type="gramStart"/>
+            <w:r>
+              <w:t>logger.info(</w:t>
+            </w:r>
+            <w:proofErr w:type="gramEnd"/>
+            <w:r>
+              <w:t>'## GLUE JOB RUN ID: ' + response['</w:t>
+            </w:r>
+            <w:proofErr w:type="spellStart"/>
+            <w:r>
+              <w:t>JobRunId</w:t>
+            </w:r>
+            <w:proofErr w:type="spellEnd"/>
+            <w:r>
+              <w:t>'])</w:t>
             </w:r>
           </w:p>
           <w:p>
@@ -2145,6 +2632,352 @@
       <w:pPr>
         <w:jc w:val="both"/>
       </w:pPr>
+    </w:p>
+    <w:p>
+      <w:pPr>
+        <w:jc w:val="both"/>
+      </w:pPr>
+    </w:p>
+    <w:p>
+      <w:pPr>
+        <w:jc w:val="both"/>
+        <w:rPr>
+          <w:b/>
+          <w:bCs/>
+          <w:lang w:val="en-US"/>
+        </w:rPr>
+      </w:pPr>
+      <w:r>
+        <w:rPr>
+          <w:b/>
+          <w:bCs/>
+          <w:lang w:val="en-US"/>
+        </w:rPr>
+        <w:t>Summary: AWS S3, Lambda, S3 Trigger, and AWS Glue</w:t>
+      </w:r>
+    </w:p>
+    <w:p>
+      <w:pPr>
+        <w:jc w:val="both"/>
+        <w:rPr>
+          <w:b/>
+          <w:bCs/>
+          <w:lang w:val="en-US"/>
+        </w:rPr>
+      </w:pPr>
+    </w:p>
+    <w:p>
+      <w:pPr>
+        <w:jc w:val="both"/>
+        <w:rPr>
+          <w:lang w:val="en-US"/>
+        </w:rPr>
+      </w:pPr>
+      <w:r>
+        <w:rPr>
+          <w:lang w:val="en-US"/>
+        </w:rPr>
+        <w:t>Amazon S3 (Simple Storage Service) is an object storage service used to store files such as CSV, JSON, and Parquet. It acts as the storage layer of a data pipeline, where raw data is uploaded and processed data can be stored for further analysis.</w:t>
+      </w:r>
+    </w:p>
+    <w:p>
+      <w:pPr>
+        <w:jc w:val="both"/>
+        <w:rPr>
+          <w:lang w:val="en-US"/>
+        </w:rPr>
+      </w:pPr>
+      <w:r>
+        <w:rPr>
+          <w:lang w:val="en-US"/>
+        </w:rPr>
+        <w:t>AWS Lambda is a serverless compute service that runs code in response to events. It allows us to automate tasks without managing servers. In a data engineering pipeline, Lambda can execute Python code, retrieve information about uploaded files, or start an AWS Glue job.</w:t>
+      </w:r>
+    </w:p>
+    <w:p>
+      <w:pPr>
+        <w:jc w:val="both"/>
+        <w:rPr>
+          <w:lang w:val="en-US"/>
+        </w:rPr>
+      </w:pPr>
+      <w:r>
+        <w:rPr>
+          <w:lang w:val="en-US"/>
+        </w:rPr>
+        <w:t xml:space="preserve">An </w:t>
+      </w:r>
+      <w:r>
+        <w:rPr>
+          <w:b/>
+          <w:bCs/>
+          <w:lang w:val="en-US"/>
+        </w:rPr>
+        <w:t>S3 Trigger</w:t>
+      </w:r>
+      <w:r>
+        <w:rPr>
+          <w:lang w:val="en-US"/>
+        </w:rPr>
+        <w:t xml:space="preserve"> is a configuration that invokes a Lambda function when a specified event occurs in an S3 bucket. For example, when a CSV file is uploaded using a PUT operation, the trigger can invoke Lambda automatically. We can optionally configure a prefix, such as data/, or a suffix, such as .csv, to filter which uploads activate the function.</w:t>
+      </w:r>
+    </w:p>
+    <w:p>
+      <w:pPr>
+        <w:jc w:val="both"/>
+        <w:rPr>
+          <w:lang w:val="en-US"/>
+        </w:rPr>
+      </w:pPr>
+      <w:r>
+        <w:rPr>
+          <w:lang w:val="en-US"/>
+        </w:rPr>
+        <w:lastRenderedPageBreak/>
+        <w:t>AWS Glue is a serverless data integration service used to perform ETL (Extract, Transform, Load). It can read raw data from S3, transform it by cleaning or changing its structure and format, and write the processed data back to S3. For example, a Glue job can convert CSV files into Parquet or ORC format for efficient storage and analytics.</w:t>
+      </w:r>
+    </w:p>
+    <w:p>
+      <w:pPr>
+        <w:jc w:val="both"/>
+        <w:rPr>
+          <w:b/>
+          <w:bCs/>
+          <w:lang w:val="en-US"/>
+        </w:rPr>
+      </w:pPr>
+      <w:r>
+        <w:rPr>
+          <w:b/>
+          <w:bCs/>
+          <w:lang w:val="en-US"/>
+        </w:rPr>
+        <w:t>How They Work Together</w:t>
+      </w:r>
+    </w:p>
+    <w:p>
+      <w:pPr>
+        <w:jc w:val="both"/>
+        <w:rPr>
+          <w:lang w:val="en-US"/>
+        </w:rPr>
+      </w:pPr>
+      <w:r>
+        <w:rPr>
+          <w:lang w:val="en-US"/>
+        </w:rPr>
+        <w:t>These services can be interconnected to create an automated data pipeline. First, a file is uploaded to an S3 bucket. The S3 trigger detects the matching upload event and invokes the Lambda function. Lambda can then execute code or call the AWS Glue API to start a configured Glue job. Glue processes the input data and saves the output to the specified S3 location.</w:t>
+      </w:r>
+    </w:p>
+    <w:p>
+      <w:pPr>
+        <w:jc w:val="both"/>
+        <w:rPr>
+          <w:lang w:val="en-US"/>
+        </w:rPr>
+      </w:pPr>
+      <w:r>
+        <w:rPr>
+          <w:lang w:val="en-US"/>
+        </w:rPr>
+        <w:t>The role of each service is:</w:t>
+      </w:r>
+    </w:p>
+    <w:p>
+      <w:pPr>
+        <w:numPr>
+          <w:ilvl w:val="0"/>
+          <w:numId w:val="3"/>
+        </w:numPr>
+        <w:jc w:val="both"/>
+        <w:rPr>
+          <w:lang w:val="en-US"/>
+        </w:rPr>
+      </w:pPr>
+      <w:r>
+        <w:rPr>
+          <w:b/>
+          <w:bCs/>
+          <w:lang w:val="en-US"/>
+        </w:rPr>
+        <w:t>Amazon S3:</w:t>
+      </w:r>
+      <w:r>
+        <w:rPr>
+          <w:lang w:val="en-US"/>
+        </w:rPr>
+        <w:t xml:space="preserve"> Stores raw and processed data.</w:t>
+      </w:r>
+    </w:p>
+    <w:p>
+      <w:pPr>
+        <w:numPr>
+          <w:ilvl w:val="0"/>
+          <w:numId w:val="3"/>
+        </w:numPr>
+        <w:jc w:val="both"/>
+        <w:rPr>
+          <w:lang w:val="en-US"/>
+        </w:rPr>
+      </w:pPr>
+      <w:r>
+        <w:rPr>
+          <w:b/>
+          <w:bCs/>
+          <w:lang w:val="en-US"/>
+        </w:rPr>
+        <w:t>S3 Trigger:</w:t>
+      </w:r>
+      <w:r>
+        <w:rPr>
+          <w:lang w:val="en-US"/>
+        </w:rPr>
+        <w:t xml:space="preserve"> Detects matching S3 events and invokes Lambda.</w:t>
+      </w:r>
+    </w:p>
+    <w:p>
+      <w:pPr>
+        <w:numPr>
+          <w:ilvl w:val="0"/>
+          <w:numId w:val="3"/>
+        </w:numPr>
+        <w:jc w:val="both"/>
+        <w:rPr>
+          <w:lang w:val="en-US"/>
+        </w:rPr>
+      </w:pPr>
+      <w:r>
+        <w:rPr>
+          <w:b/>
+          <w:bCs/>
+          <w:lang w:val="en-US"/>
+        </w:rPr>
+        <w:t>AWS Lambda:</w:t>
+      </w:r>
+      <w:r>
+        <w:rPr>
+          <w:lang w:val="en-US"/>
+        </w:rPr>
+        <w:t xml:space="preserve"> Runs code and initiates automated tasks, such as starting a Glue job.</w:t>
+      </w:r>
+    </w:p>
+    <w:p>
+      <w:pPr>
+        <w:numPr>
+          <w:ilvl w:val="0"/>
+          <w:numId w:val="3"/>
+        </w:numPr>
+        <w:jc w:val="both"/>
+        <w:rPr>
+          <w:lang w:val="en-US"/>
+        </w:rPr>
+      </w:pPr>
+      <w:r>
+        <w:rPr>
+          <w:b/>
+          <w:bCs/>
+          <w:lang w:val="en-US"/>
+        </w:rPr>
+        <w:t>AWS Glue:</w:t>
+      </w:r>
+      <w:r>
+        <w:rPr>
+          <w:lang w:val="en-US"/>
+        </w:rPr>
+        <w:t xml:space="preserve"> Performs ETL operations to transform and process data.</w:t>
+      </w:r>
+    </w:p>
+    <w:p>
+      <w:pPr>
+        <w:jc w:val="both"/>
+        <w:rPr>
+          <w:lang w:val="en-US"/>
+        </w:rPr>
+      </w:pPr>
+      <w:r>
+        <w:rPr>
+          <w:lang w:val="en-US"/>
+        </w:rPr>
+        <w:t>In the practical exercise, the first Lambda function retrieves an uploaded object's bucket name and key, reads the object using s3.get_</w:t>
+      </w:r>
+      <w:proofErr w:type="gramStart"/>
+      <w:r>
+        <w:rPr>
+          <w:lang w:val="en-US"/>
+        </w:rPr>
+        <w:t>object(</w:t>
+      </w:r>
+      <w:proofErr w:type="gramEnd"/>
+      <w:r>
+        <w:rPr>
+          <w:lang w:val="en-US"/>
+        </w:rPr>
+        <w:t xml:space="preserve">), and prints its content type and file information. The second Lambda function uses </w:t>
+      </w:r>
+      <w:proofErr w:type="spellStart"/>
+      <w:proofErr w:type="gramStart"/>
+      <w:r>
+        <w:rPr>
+          <w:lang w:val="en-US"/>
+        </w:rPr>
+        <w:t>glue.start</w:t>
+      </w:r>
+      <w:proofErr w:type="gramEnd"/>
+      <w:r>
+        <w:rPr>
+          <w:lang w:val="en-US"/>
+        </w:rPr>
+        <w:t>_job_</w:t>
+      </w:r>
+      <w:proofErr w:type="gramStart"/>
+      <w:r>
+        <w:rPr>
+          <w:lang w:val="en-US"/>
+        </w:rPr>
+        <w:t>run</w:t>
+      </w:r>
+      <w:proofErr w:type="spellEnd"/>
+      <w:r>
+        <w:rPr>
+          <w:lang w:val="en-US"/>
+        </w:rPr>
+        <w:t>(</w:t>
+      </w:r>
+      <w:proofErr w:type="gramEnd"/>
+      <w:r>
+        <w:rPr>
+          <w:lang w:val="en-US"/>
+        </w:rPr>
+        <w:t xml:space="preserve">) to start an existing Glue job named </w:t>
+      </w:r>
+      <w:proofErr w:type="spellStart"/>
+      <w:r>
+        <w:rPr>
+          <w:lang w:val="en-US"/>
+        </w:rPr>
+        <w:t>csv_non_parts_toORC</w:t>
+      </w:r>
+      <w:proofErr w:type="spellEnd"/>
+      <w:r>
+        <w:rPr>
+          <w:lang w:val="en-US"/>
+        </w:rPr>
+        <w:t>.</w:t>
+      </w:r>
+    </w:p>
+    <w:p>
+      <w:pPr>
+        <w:jc w:val="both"/>
+        <w:rPr>
+          <w:lang w:val="en-US"/>
+        </w:rPr>
+      </w:pPr>
+      <w:r>
+        <w:rPr>
+          <w:lang w:val="en-US"/>
+        </w:rPr>
+        <w:t>In conclusion, S3, Lambda, S3 triggers, and Glue work together to automate data engineering workflows. S3 provides storage, triggers initiate event-driven execution, Lambda handles automation, and Glue performs data processing. Together, they help build scalable data pipelines with minimal manual intervention.</w:t>
+      </w:r>
     </w:p>
     <w:p>
       <w:pPr>
@@ -2389,11 +3222,163 @@
       </w:rPr>
     </w:lvl>
   </w:abstractNum>
+  <w:abstractNum w:abstractNumId="2" w15:restartNumberingAfterBreak="0">
+    <w:nsid w:val="4FA129A4"/>
+    <w:multiLevelType w:val="multilevel"/>
+    <w:tmpl w:val="60309604"/>
+    <w:lvl w:ilvl="0">
+      <w:start w:val="1"/>
+      <w:numFmt w:val="bullet"/>
+      <w:lvlText w:val=""/>
+      <w:lvlJc w:val="left"/>
+      <w:pPr>
+        <w:tabs>
+          <w:tab w:val="num" w:pos="720"/>
+        </w:tabs>
+        <w:ind w:left="720" w:hanging="360"/>
+      </w:pPr>
+      <w:rPr>
+        <w:rFonts w:ascii="Symbol" w:hAnsi="Symbol" w:hint="default"/>
+        <w:sz w:val="20"/>
+      </w:rPr>
+    </w:lvl>
+    <w:lvl w:ilvl="1" w:tentative="1">
+      <w:start w:val="1"/>
+      <w:numFmt w:val="bullet"/>
+      <w:lvlText w:val="o"/>
+      <w:lvlJc w:val="left"/>
+      <w:pPr>
+        <w:tabs>
+          <w:tab w:val="num" w:pos="1440"/>
+        </w:tabs>
+        <w:ind w:left="1440" w:hanging="360"/>
+      </w:pPr>
+      <w:rPr>
+        <w:rFonts w:ascii="Courier New" w:hAnsi="Courier New" w:hint="default"/>
+        <w:sz w:val="20"/>
+      </w:rPr>
+    </w:lvl>
+    <w:lvl w:ilvl="2" w:tentative="1">
+      <w:start w:val="1"/>
+      <w:numFmt w:val="bullet"/>
+      <w:lvlText w:val=""/>
+      <w:lvlJc w:val="left"/>
+      <w:pPr>
+        <w:tabs>
+          <w:tab w:val="num" w:pos="2160"/>
+        </w:tabs>
+        <w:ind w:left="2160" w:hanging="360"/>
+      </w:pPr>
+      <w:rPr>
+        <w:rFonts w:ascii="Wingdings" w:hAnsi="Wingdings" w:hint="default"/>
+        <w:sz w:val="20"/>
+      </w:rPr>
+    </w:lvl>
+    <w:lvl w:ilvl="3" w:tentative="1">
+      <w:start w:val="1"/>
+      <w:numFmt w:val="bullet"/>
+      <w:lvlText w:val=""/>
+      <w:lvlJc w:val="left"/>
+      <w:pPr>
+        <w:tabs>
+          <w:tab w:val="num" w:pos="2880"/>
+        </w:tabs>
+        <w:ind w:left="2880" w:hanging="360"/>
+      </w:pPr>
+      <w:rPr>
+        <w:rFonts w:ascii="Wingdings" w:hAnsi="Wingdings" w:hint="default"/>
+        <w:sz w:val="20"/>
+      </w:rPr>
+    </w:lvl>
+    <w:lvl w:ilvl="4" w:tentative="1">
+      <w:start w:val="1"/>
+      <w:numFmt w:val="bullet"/>
+      <w:lvlText w:val=""/>
+      <w:lvlJc w:val="left"/>
+      <w:pPr>
+        <w:tabs>
+          <w:tab w:val="num" w:pos="3600"/>
+        </w:tabs>
+        <w:ind w:left="3600" w:hanging="360"/>
+      </w:pPr>
+      <w:rPr>
+        <w:rFonts w:ascii="Wingdings" w:hAnsi="Wingdings" w:hint="default"/>
+        <w:sz w:val="20"/>
+      </w:rPr>
+    </w:lvl>
+    <w:lvl w:ilvl="5" w:tentative="1">
+      <w:start w:val="1"/>
+      <w:numFmt w:val="bullet"/>
+      <w:lvlText w:val=""/>
+      <w:lvlJc w:val="left"/>
+      <w:pPr>
+        <w:tabs>
+          <w:tab w:val="num" w:pos="4320"/>
+        </w:tabs>
+        <w:ind w:left="4320" w:hanging="360"/>
+      </w:pPr>
+      <w:rPr>
+        <w:rFonts w:ascii="Wingdings" w:hAnsi="Wingdings" w:hint="default"/>
+        <w:sz w:val="20"/>
+      </w:rPr>
+    </w:lvl>
+    <w:lvl w:ilvl="6" w:tentative="1">
+      <w:start w:val="1"/>
+      <w:numFmt w:val="bullet"/>
+      <w:lvlText w:val=""/>
+      <w:lvlJc w:val="left"/>
+      <w:pPr>
+        <w:tabs>
+          <w:tab w:val="num" w:pos="5040"/>
+        </w:tabs>
+        <w:ind w:left="5040" w:hanging="360"/>
+      </w:pPr>
+      <w:rPr>
+        <w:rFonts w:ascii="Wingdings" w:hAnsi="Wingdings" w:hint="default"/>
+        <w:sz w:val="20"/>
+      </w:rPr>
+    </w:lvl>
+    <w:lvl w:ilvl="7" w:tentative="1">
+      <w:start w:val="1"/>
+      <w:numFmt w:val="bullet"/>
+      <w:lvlText w:val=""/>
+      <w:lvlJc w:val="left"/>
+      <w:pPr>
+        <w:tabs>
+          <w:tab w:val="num" w:pos="5760"/>
+        </w:tabs>
+        <w:ind w:left="5760" w:hanging="360"/>
+      </w:pPr>
+      <w:rPr>
+        <w:rFonts w:ascii="Wingdings" w:hAnsi="Wingdings" w:hint="default"/>
+        <w:sz w:val="20"/>
+      </w:rPr>
+    </w:lvl>
+    <w:lvl w:ilvl="8" w:tentative="1">
+      <w:start w:val="1"/>
+      <w:numFmt w:val="bullet"/>
+      <w:lvlText w:val=""/>
+      <w:lvlJc w:val="left"/>
+      <w:pPr>
+        <w:tabs>
+          <w:tab w:val="num" w:pos="6480"/>
+        </w:tabs>
+        <w:ind w:left="6480" w:hanging="360"/>
+      </w:pPr>
+      <w:rPr>
+        <w:rFonts w:ascii="Wingdings" w:hAnsi="Wingdings" w:hint="default"/>
+        <w:sz w:val="20"/>
+      </w:rPr>
+    </w:lvl>
+  </w:abstractNum>
   <w:num w:numId="1" w16cid:durableId="599996585">
     <w:abstractNumId w:val="1"/>
   </w:num>
   <w:num w:numId="2" w16cid:durableId="381027615">
     <w:abstractNumId w:val="0"/>
+  </w:num>
+  <w:num w:numId="3" w16cid:durableId="1387140504">
+    <w:abstractNumId w:val="2"/>
   </w:num>
 </w:numbering>
 </file>
@@ -2913,7 +3898,6 @@
   <w:style w:type="character" w:default="1" w:styleId="DefaultParagraphFont">
     <w:name w:val="Default Paragraph Font"/>
     <w:uiPriority w:val="1"/>
-    <w:semiHidden/>
     <w:unhideWhenUsed/>
   </w:style>
   <w:style w:type="table" w:default="1" w:styleId="TableNormal">

</xml_diff>